<commit_message>
relativize folder functions, missing release docs
</commit_message>
<xml_diff>
--- a/doc/sources/rt-VIL Language Spec.docx
+++ b/doc/sources/rt-VIL Language Spec.docx
@@ -304,16 +304,7 @@
           <w:szCs w:val="28"/>
           <w:lang w:val="en-GB"/>
         </w:rPr>
-        <w:t>20</w:t>
-      </w:r>
-      <w:r>
-        <w:rPr>
-          <w:b/>
-          <w:sz w:val="28"/>
-          <w:szCs w:val="28"/>
-          <w:lang w:val="en-GB"/>
-        </w:rPr>
-        <w:t>26</w:t>
+        <w:t>2026</w:t>
       </w:r>
     </w:p>
     <w:p>
@@ -1079,7 +1070,27 @@
           <w:szCs w:val="20"/>
           <w:lang w:val="en-GB"/>
         </w:rPr>
-        <w:t xml:space="preserve">The spell checking language </w:t>
+        <w:t xml:space="preserve">The </w:t>
+      </w:r>
+      <w:proofErr w:type="gramStart"/>
+      <w:r>
+        <w:rPr>
+          <w:rFonts w:ascii="Arial" w:hAnsi="Arial" w:cs="Arial"/>
+          <w:sz w:val="20"/>
+          <w:szCs w:val="20"/>
+          <w:lang w:val="en-GB"/>
+        </w:rPr>
+        <w:t>spell checking</w:t>
+      </w:r>
+      <w:proofErr w:type="gramEnd"/>
+      <w:r>
+        <w:rPr>
+          <w:rFonts w:ascii="Arial" w:hAnsi="Arial" w:cs="Arial"/>
+          <w:sz w:val="20"/>
+          <w:szCs w:val="20"/>
+          <w:lang w:val="en-GB"/>
+        </w:rPr>
+        <w:t xml:space="preserve"> language </w:t>
       </w:r>
       <w:r>
         <w:rPr>
@@ -3388,7 +3399,6 @@
           <w:szCs w:val="32"/>
           <w:lang w:val="en-GB"/>
         </w:rPr>
-        <w:lastRenderedPageBreak/>
         <w:t>Table of Figures</w:t>
       </w:r>
       <w:bookmarkEnd w:id="1"/>
@@ -3460,7 +3470,6 @@
         <w:rPr>
           <w:lang w:val="en-GB"/>
         </w:rPr>
-        <w:lastRenderedPageBreak/>
         <w:t>Introduction</w:t>
       </w:r>
       <w:bookmarkEnd w:id="2"/>
@@ -3873,11 +3882,19 @@
         </w:rPr>
         <w:t>rt-</w:t>
       </w:r>
-      <w:r>
-        <w:rPr>
-          <w:lang w:val="en-GB"/>
-        </w:rPr>
-        <w:t>VIL  as a reference.</w:t>
+      <w:proofErr w:type="gramStart"/>
+      <w:r>
+        <w:rPr>
+          <w:lang w:val="en-GB"/>
+        </w:rPr>
+        <w:t>VIL  as</w:t>
+      </w:r>
+      <w:proofErr w:type="gramEnd"/>
+      <w:r>
+        <w:rPr>
+          <w:lang w:val="en-GB"/>
+        </w:rPr>
+        <w:t xml:space="preserve"> a reference.</w:t>
       </w:r>
     </w:p>
     <w:p>
@@ -7522,7 +7539,6 @@
         <w:rPr>
           <w:lang w:val="en-GB"/>
         </w:rPr>
-        <w:lastRenderedPageBreak/>
         <w:t xml:space="preserve">Runtime </w:t>
       </w:r>
       <w:r>
@@ -8102,7 +8118,6 @@
         <w:rPr>
           <w:lang w:val="en-US"/>
         </w:rPr>
-        <w:lastRenderedPageBreak/>
         <w:t xml:space="preserve">In a script, all decision variables of the (runtime) configuration are available through their (qualified) name. As IVML configurations may be partial or even composed dynamically, the actual decision variables, their types and type definitions are not necessarily known at the point in time when the script is specified. Thus, the validity of IVML names can only be determined at execution time of the script when also the actual (runtime) configuration is known. This may complicate the development of VIL scripts as actually unknown identifiers will at least lead to a warning. To support the Adaptation Manager in specifying valid and readable scripts, rt-VIL provides the </w:t>
       </w:r>
       <w:r>
@@ -8761,8 +8776,25 @@
           <w:sz w:val="24"/>
           <w:szCs w:val="24"/>
         </w:rPr>
-        <w:lastRenderedPageBreak/>
-        <w:t>A rt-VIL script may contain strategies, tactics and VIL rules. While there is no predefined sequence of defining strategies and tactics, the actual definition sequence is taken into account if, however, the respective preconditions does not lead to a unique selection of strategies or tactics at execution time. VIL rules can be used to define functions or instantiation tasks. The sequence of VIL rules is not relevant for execution. Extending scripts may override strategies, tactics and rules by specifying the same signature as the original declaration in an extended script. Further, extending scripts may participate in dynamically dispatched execution by defining new typed alternatives.</w:t>
+        <w:t xml:space="preserve">A rt-VIL script may contain strategies, tactics and VIL rules. While there is no predefined sequence of defining strategies and tactics, the actual definition sequence is taken into account if, however, the respective preconditions </w:t>
+      </w:r>
+      <w:proofErr w:type="gramStart"/>
+      <w:r>
+        <w:rPr>
+          <w:rFonts w:asciiTheme="majorHAnsi" w:hAnsiTheme="majorHAnsi"/>
+          <w:sz w:val="24"/>
+          <w:szCs w:val="24"/>
+        </w:rPr>
+        <w:t>does</w:t>
+      </w:r>
+      <w:proofErr w:type="gramEnd"/>
+      <w:r>
+        <w:rPr>
+          <w:rFonts w:asciiTheme="majorHAnsi" w:hAnsiTheme="majorHAnsi"/>
+          <w:sz w:val="24"/>
+          <w:szCs w:val="24"/>
+        </w:rPr>
+        <w:t xml:space="preserve"> not lead to a unique selection of strategies or tactics at execution time. VIL rules can be used to define functions or instantiation tasks. The sequence of VIL rules is not relevant for execution. Extending scripts may override strategies, tactics and rules by specifying the same signature as the original declaration in an extended script. Further, extending scripts may participate in dynamically dispatched execution by defining new typed alternatives.</w:t>
       </w:r>
     </w:p>
     <w:p>
@@ -8801,7 +8833,25 @@
           <w:szCs w:val="22"/>
           <w:lang w:val="en-US"/>
         </w:rPr>
-        <w:t>@advice(QM)</w:t>
+        <w:t>@</w:t>
+      </w:r>
+      <w:proofErr w:type="gramStart"/>
+      <w:r>
+        <w:rPr>
+          <w:rFonts w:ascii="Courier New" w:eastAsia="Times New Roman" w:hAnsi="Courier New" w:cs="Courier New"/>
+          <w:szCs w:val="22"/>
+          <w:lang w:val="en-US"/>
+        </w:rPr>
+        <w:t>advice(</w:t>
+      </w:r>
+      <w:proofErr w:type="gramEnd"/>
+      <w:r>
+        <w:rPr>
+          <w:rFonts w:ascii="Courier New" w:eastAsia="Times New Roman" w:hAnsi="Courier New" w:cs="Courier New"/>
+          <w:szCs w:val="22"/>
+          <w:lang w:val="en-US"/>
+        </w:rPr>
+        <w:t>QM)</w:t>
       </w:r>
     </w:p>
     <w:p>
@@ -9159,16 +9209,7 @@
           <w:sz w:val="24"/>
           <w:szCs w:val="24"/>
         </w:rPr>
-        <w:t xml:space="preserve">A strategy can specify multiple sub-strategies and tactics to realize the adaptation towards the actual (failing) objective. The selection of the sub-strategies and tactics during script execution can be static or dynamic. In the </w:t>
-      </w:r>
-      <w:r>
-        <w:rPr>
-          <w:rFonts w:asciiTheme="majorHAnsi" w:hAnsiTheme="majorHAnsi"/>
-          <w:sz w:val="24"/>
-          <w:szCs w:val="24"/>
-        </w:rPr>
-        <w:lastRenderedPageBreak/>
-        <w:t xml:space="preserve">static case, the first applicable sub-strategy or tactic in the given sequence is executed depending on their preconditions. In the dynamic case, a weighting function determines the ranking of the sub-strategies and tactics, which, in turn, determines the sub-strategy or tactic to be executed. </w:t>
+        <w:t xml:space="preserve">A strategy can specify multiple sub-strategies and tactics to realize the adaptation towards the actual (failing) objective. The selection of the sub-strategies and tactics during script execution can be static or dynamic. In the static case, the first applicable sub-strategy or tactic in the given sequence is executed depending on their preconditions. In the dynamic case, a weighting function determines the ranking of the sub-strategies and tactics, which, in turn, determines the sub-strategy or tactic to be executed. </w:t>
       </w:r>
       <w:r>
         <w:rPr>
@@ -9216,7 +9257,25 @@
           <w:sz w:val="24"/>
           <w:szCs w:val="24"/>
         </w:rPr>
-        <w:t>we allow sub-strategies to enable a hierarchical breakdown of the adaptation specification along nested structures of the underlying application  and, thus, dynamic execution also on the nested levels.</w:t>
+        <w:t xml:space="preserve">we allow sub-strategies to enable a hierarchical breakdown of the adaptation specification along nested structures of the underlying </w:t>
+      </w:r>
+      <w:proofErr w:type="gramStart"/>
+      <w:r>
+        <w:rPr>
+          <w:rFonts w:asciiTheme="majorHAnsi" w:hAnsiTheme="majorHAnsi"/>
+          <w:sz w:val="24"/>
+          <w:szCs w:val="24"/>
+        </w:rPr>
+        <w:t>application  and</w:t>
+      </w:r>
+      <w:proofErr w:type="gramEnd"/>
+      <w:r>
+        <w:rPr>
+          <w:rFonts w:asciiTheme="majorHAnsi" w:hAnsiTheme="majorHAnsi"/>
+          <w:sz w:val="24"/>
+          <w:szCs w:val="24"/>
+        </w:rPr>
+        <w:t>, thus, dynamic execution also on the nested levels.</w:t>
       </w:r>
     </w:p>
     <w:p>
@@ -9469,7 +9528,25 @@
           <w:sz w:val="24"/>
           <w:szCs w:val="24"/>
         </w:rPr>
-        <w:t xml:space="preserve">into sub-strategies and tasks  and </w:t>
+        <w:t xml:space="preserve">into sub-strategies and </w:t>
+      </w:r>
+      <w:proofErr w:type="gramStart"/>
+      <w:r>
+        <w:rPr>
+          <w:rFonts w:asciiTheme="majorHAnsi" w:hAnsiTheme="majorHAnsi"/>
+          <w:sz w:val="24"/>
+          <w:szCs w:val="24"/>
+        </w:rPr>
+        <w:t>tasks  and</w:t>
+      </w:r>
+      <w:proofErr w:type="gramEnd"/>
+      <w:r>
+        <w:rPr>
+          <w:rFonts w:asciiTheme="majorHAnsi" w:hAnsiTheme="majorHAnsi"/>
+          <w:sz w:val="24"/>
+          <w:szCs w:val="24"/>
+        </w:rPr>
+        <w:t xml:space="preserve"> </w:t>
       </w:r>
     </w:p>
     <w:p>
@@ -9509,7 +9586,25 @@
           <w:sz w:val="24"/>
           <w:szCs w:val="24"/>
         </w:rPr>
-        <w:t>Actually, the objective is optional, in particular to support startup and shutdown strategies, which may need to be executed regardless of objectives. Also the weighting function is optional in order to enable static (reactive) rule-based adaptation. Please note that both, objective and weighting function may rely on VIL rules or basic operations that can be provided by programmed extensions</w:t>
+        <w:t xml:space="preserve">Actually, the objective is optional, in particular to support startup and shutdown strategies, which may need to be executed regardless of objectives. </w:t>
+      </w:r>
+      <w:proofErr w:type="gramStart"/>
+      <w:r>
+        <w:rPr>
+          <w:rFonts w:asciiTheme="majorHAnsi" w:hAnsiTheme="majorHAnsi"/>
+          <w:sz w:val="24"/>
+          <w:szCs w:val="24"/>
+        </w:rPr>
+        <w:t>Also</w:t>
+      </w:r>
+      <w:proofErr w:type="gramEnd"/>
+      <w:r>
+        <w:rPr>
+          <w:rFonts w:asciiTheme="majorHAnsi" w:hAnsiTheme="majorHAnsi"/>
+          <w:sz w:val="24"/>
+          <w:szCs w:val="24"/>
+        </w:rPr>
+        <w:t xml:space="preserve"> the weighting function is optional in order to enable static (reactive) rule-based adaptation. Please note that both, objective and weighting function may rely on VIL rules or basic operations that can be provided by programmed extensions</w:t>
       </w:r>
       <w:r>
         <w:rPr>
@@ -9553,7 +9648,25 @@
           <w:szCs w:val="22"/>
           <w:lang w:val="en-US"/>
         </w:rPr>
-        <w:t xml:space="preserve"> name (ParameterList) = post : pre {</w:t>
+        <w:t xml:space="preserve"> name (ParameterList) = </w:t>
+      </w:r>
+      <w:proofErr w:type="gramStart"/>
+      <w:r>
+        <w:rPr>
+          <w:rFonts w:ascii="Courier New" w:eastAsia="Times New Roman" w:hAnsi="Courier New" w:cs="Courier New"/>
+          <w:szCs w:val="22"/>
+          <w:lang w:val="en-US"/>
+        </w:rPr>
+        <w:t>post :</w:t>
+      </w:r>
+      <w:proofErr w:type="gramEnd"/>
+      <w:r>
+        <w:rPr>
+          <w:rFonts w:ascii="Courier New" w:eastAsia="Times New Roman" w:hAnsi="Courier New" w:cs="Courier New"/>
+          <w:szCs w:val="22"/>
+          <w:lang w:val="en-US"/>
+        </w:rPr>
+        <w:t xml:space="preserve"> pre {</w:t>
       </w:r>
     </w:p>
     <w:p>
@@ -9572,7 +9685,6 @@
           <w:szCs w:val="22"/>
           <w:lang w:val="en-US"/>
         </w:rPr>
-        <w:lastRenderedPageBreak/>
         <w:t xml:space="preserve">  // local variable declarations</w:t>
       </w:r>
     </w:p>
@@ -9681,7 +9793,25 @@
           <w:szCs w:val="22"/>
           <w:lang w:val="en-US"/>
         </w:rPr>
-        <w:t xml:space="preserve"> (name : expression);</w:t>
+        <w:t xml:space="preserve"> (</w:t>
+      </w:r>
+      <w:proofErr w:type="gramStart"/>
+      <w:r>
+        <w:rPr>
+          <w:rFonts w:ascii="Courier New" w:eastAsia="Times New Roman" w:hAnsi="Courier New" w:cs="Courier New"/>
+          <w:szCs w:val="22"/>
+          <w:lang w:val="en-US"/>
+        </w:rPr>
+        <w:t>name :</w:t>
+      </w:r>
+      <w:proofErr w:type="gramEnd"/>
+      <w:r>
+        <w:rPr>
+          <w:rFonts w:ascii="Courier New" w:eastAsia="Times New Roman" w:hAnsi="Courier New" w:cs="Courier New"/>
+          <w:szCs w:val="22"/>
+          <w:lang w:val="en-US"/>
+        </w:rPr>
+        <w:t xml:space="preserve"> expression);</w:t>
       </w:r>
     </w:p>
     <w:p>
@@ -9736,7 +9866,25 @@
           <w:szCs w:val="22"/>
           <w:lang w:val="en-US"/>
         </w:rPr>
-        <w:t xml:space="preserve"> name(ParameterList);</w:t>
+        <w:t xml:space="preserve"> </w:t>
+      </w:r>
+      <w:proofErr w:type="gramStart"/>
+      <w:r>
+        <w:rPr>
+          <w:rFonts w:ascii="Courier New" w:eastAsia="Times New Roman" w:hAnsi="Courier New" w:cs="Courier New"/>
+          <w:szCs w:val="22"/>
+          <w:lang w:val="en-US"/>
+        </w:rPr>
+        <w:t>name(</w:t>
+      </w:r>
+      <w:proofErr w:type="gramEnd"/>
+      <w:r>
+        <w:rPr>
+          <w:rFonts w:ascii="Courier New" w:eastAsia="Times New Roman" w:hAnsi="Courier New" w:cs="Courier New"/>
+          <w:szCs w:val="22"/>
+          <w:lang w:val="en-US"/>
+        </w:rPr>
+        <w:t>ParameterList);</w:t>
       </w:r>
     </w:p>
     <w:p>
@@ -9804,7 +9952,25 @@
           <w:szCs w:val="22"/>
           <w:lang w:val="en-US"/>
         </w:rPr>
-        <w:t xml:space="preserve"> name(ParameterList);</w:t>
+        <w:t xml:space="preserve"> </w:t>
+      </w:r>
+      <w:proofErr w:type="gramStart"/>
+      <w:r>
+        <w:rPr>
+          <w:rFonts w:ascii="Courier New" w:eastAsia="Times New Roman" w:hAnsi="Courier New" w:cs="Courier New"/>
+          <w:szCs w:val="22"/>
+          <w:lang w:val="en-US"/>
+        </w:rPr>
+        <w:t>name(</w:t>
+      </w:r>
+      <w:proofErr w:type="gramEnd"/>
+      <w:r>
+        <w:rPr>
+          <w:rFonts w:ascii="Courier New" w:eastAsia="Times New Roman" w:hAnsi="Courier New" w:cs="Courier New"/>
+          <w:szCs w:val="22"/>
+          <w:lang w:val="en-US"/>
+        </w:rPr>
+        <w:t>ParameterList);</w:t>
       </w:r>
     </w:p>
     <w:p>
@@ -9872,7 +10038,25 @@
           <w:szCs w:val="22"/>
           <w:lang w:val="en-US"/>
         </w:rPr>
-        <w:t xml:space="preserve"> name(ParameterList) </w:t>
+        <w:t xml:space="preserve"> </w:t>
+      </w:r>
+      <w:proofErr w:type="gramStart"/>
+      <w:r>
+        <w:rPr>
+          <w:rFonts w:ascii="Courier New" w:eastAsia="Times New Roman" w:hAnsi="Courier New" w:cs="Courier New"/>
+          <w:szCs w:val="22"/>
+          <w:lang w:val="en-US"/>
+        </w:rPr>
+        <w:t>name(</w:t>
+      </w:r>
+      <w:proofErr w:type="gramEnd"/>
+      <w:r>
+        <w:rPr>
+          <w:rFonts w:ascii="Courier New" w:eastAsia="Times New Roman" w:hAnsi="Courier New" w:cs="Courier New"/>
+          <w:szCs w:val="22"/>
+          <w:lang w:val="en-US"/>
+        </w:rPr>
+        <w:t xml:space="preserve">ParameterList) </w:t>
       </w:r>
     </w:p>
     <w:p>
@@ -9944,7 +10128,25 @@
           <w:szCs w:val="22"/>
           <w:lang w:val="en-US"/>
         </w:rPr>
-        <w:t xml:space="preserve"> guardExpression name(ParameterList)</w:t>
+        <w:t xml:space="preserve"> guardExpression </w:t>
+      </w:r>
+      <w:proofErr w:type="gramStart"/>
+      <w:r>
+        <w:rPr>
+          <w:rFonts w:ascii="Courier New" w:eastAsia="Times New Roman" w:hAnsi="Courier New" w:cs="Courier New"/>
+          <w:szCs w:val="22"/>
+          <w:lang w:val="en-US"/>
+        </w:rPr>
+        <w:t>name(</w:t>
+      </w:r>
+      <w:proofErr w:type="gramEnd"/>
+      <w:r>
+        <w:rPr>
+          <w:rFonts w:ascii="Courier New" w:eastAsia="Times New Roman" w:hAnsi="Courier New" w:cs="Courier New"/>
+          <w:szCs w:val="22"/>
+          <w:lang w:val="en-US"/>
+        </w:rPr>
+        <w:t>ParameterList)</w:t>
       </w:r>
     </w:p>
     <w:p>
@@ -10045,7 +10247,25 @@
           <w:szCs w:val="22"/>
           <w:lang w:val="en-US"/>
         </w:rPr>
-        <w:t xml:space="preserve"> guardExpression name(ParameterList);</w:t>
+        <w:t xml:space="preserve"> guardExpression </w:t>
+      </w:r>
+      <w:proofErr w:type="gramStart"/>
+      <w:r>
+        <w:rPr>
+          <w:rFonts w:ascii="Courier New" w:eastAsia="Times New Roman" w:hAnsi="Courier New" w:cs="Courier New"/>
+          <w:szCs w:val="22"/>
+          <w:lang w:val="en-US"/>
+        </w:rPr>
+        <w:t>name(</w:t>
+      </w:r>
+      <w:proofErr w:type="gramEnd"/>
+      <w:r>
+        <w:rPr>
+          <w:rFonts w:ascii="Courier New" w:eastAsia="Times New Roman" w:hAnsi="Courier New" w:cs="Courier New"/>
+          <w:szCs w:val="22"/>
+          <w:lang w:val="en-US"/>
+        </w:rPr>
+        <w:t>ParameterList);</w:t>
       </w:r>
     </w:p>
     <w:p>
@@ -10294,16 +10514,7 @@
           <w:sz w:val="24"/>
           <w:szCs w:val="24"/>
         </w:rPr>
-        <w:t xml:space="preserve">The objective states a logical condition utilizing observed quality properties (via the runtime variables of the configuration) in expressions such as their </w:t>
-      </w:r>
-      <w:r>
-        <w:rPr>
-          <w:rFonts w:asciiTheme="majorHAnsi" w:hAnsiTheme="majorHAnsi"/>
-          <w:sz w:val="24"/>
-          <w:szCs w:val="24"/>
-        </w:rPr>
-        <w:lastRenderedPageBreak/>
-        <w:t>target range or utility / cost functions. Please note that the objective is a part of the precondition, which is syntactically highlighted due to its importance for adaptation.</w:t>
+        <w:t>The objective states a logical condition utilizing observed quality properties (via the runtime variables of the configuration) in expressions such as their target range or utility / cost functions. Please note that the objective is a part of the precondition, which is syntactically highlighted due to its importance for adaptation.</w:t>
       </w:r>
     </w:p>
     <w:p>
@@ -10379,7 +10590,25 @@
           <w:sz w:val="24"/>
           <w:szCs w:val="24"/>
         </w:rPr>
-        <w:t xml:space="preserve">determines the ranking of the sub-strategies and tactics. Basically it is a function that maps the alternatives (sub-strategies or tactics) under consideration of the actual system state (taken from the runtime configuration or the runtime components) to a real value, e.g., using a utility-cost calculation. Thereby, it acts like an iterator over the alternatives and selects the option </w:t>
+        <w:t xml:space="preserve">determines the ranking of the sub-strategies and tactics. </w:t>
+      </w:r>
+      <w:proofErr w:type="gramStart"/>
+      <w:r>
+        <w:rPr>
+          <w:rFonts w:asciiTheme="majorHAnsi" w:hAnsiTheme="majorHAnsi"/>
+          <w:sz w:val="24"/>
+          <w:szCs w:val="24"/>
+        </w:rPr>
+        <w:t>Basically</w:t>
+      </w:r>
+      <w:proofErr w:type="gramEnd"/>
+      <w:r>
+        <w:rPr>
+          <w:rFonts w:asciiTheme="majorHAnsi" w:hAnsiTheme="majorHAnsi"/>
+          <w:sz w:val="24"/>
+          <w:szCs w:val="24"/>
+        </w:rPr>
+        <w:t xml:space="preserve"> it is a function that maps the alternatives (sub-strategies or tactics) under consideration of the actual system state (taken from the runtime configuration or the runtime components) to a real value, e.g., using a utility-cost calculation. Thereby, it acts like an iterator over the alternatives and selects the option </w:t>
       </w:r>
       <w:r>
         <w:rPr>
@@ -10606,7 +10835,6 @@
           <w:sz w:val="24"/>
           <w:szCs w:val="24"/>
         </w:rPr>
-        <w:lastRenderedPageBreak/>
         <w:fldChar w:fldCharType="begin"/>
       </w:r>
       <w:r>
@@ -10654,7 +10882,25 @@
           <w:sz w:val="24"/>
           <w:szCs w:val="24"/>
         </w:rPr>
-        <w:t xml:space="preserve"> for the fail statement). Then the next possible strategy is executed. If there is no further strategy, the execution of the script terminates with an adaptation failure.</w:t>
+        <w:t xml:space="preserve"> for the </w:t>
+      </w:r>
+      <w:proofErr w:type="gramStart"/>
+      <w:r>
+        <w:rPr>
+          <w:rFonts w:asciiTheme="majorHAnsi" w:hAnsiTheme="majorHAnsi"/>
+          <w:sz w:val="24"/>
+          <w:szCs w:val="24"/>
+        </w:rPr>
+        <w:t>fail</w:t>
+      </w:r>
+      <w:proofErr w:type="gramEnd"/>
+      <w:r>
+        <w:rPr>
+          <w:rFonts w:asciiTheme="majorHAnsi" w:hAnsiTheme="majorHAnsi"/>
+          <w:sz w:val="24"/>
+          <w:szCs w:val="24"/>
+        </w:rPr>
+        <w:t xml:space="preserve"> statement). Then the next possible strategy is executed. If there is no further strategy, the execution of the script terminates with an adaptation failure.</w:t>
       </w:r>
     </w:p>
     <w:p>
@@ -10933,6 +11179,7 @@
           <w:szCs w:val="22"/>
         </w:rPr>
       </w:pPr>
+      <w:proofErr w:type="gramStart"/>
       <w:r>
         <w:rPr>
           <w:rFonts w:ascii="Courier New" w:eastAsia="Courier New" w:hAnsi="Courier New" w:cs="Courier New"/>
@@ -10945,7 +11192,15 @@
           <w:rFonts w:ascii="Courier New" w:eastAsia="Courier New" w:hAnsi="Courier New" w:cs="Courier New"/>
           <w:szCs w:val="22"/>
         </w:rPr>
-        <w:t>(Strategy strategy</w:t>
+        <w:t>(</w:t>
+      </w:r>
+      <w:proofErr w:type="gramEnd"/>
+      <w:r>
+        <w:rPr>
+          <w:rFonts w:ascii="Courier New" w:eastAsia="Courier New" w:hAnsi="Courier New" w:cs="Courier New"/>
+          <w:szCs w:val="22"/>
+        </w:rPr>
+        <w:t>Strategy strategy</w:t>
       </w:r>
       <w:r>
         <w:rPr>
@@ -11212,6 +11467,7 @@
         </w:rPr>
         <w:t xml:space="preserve">  </w:t>
       </w:r>
+      <w:proofErr w:type="gramStart"/>
       <w:r>
         <w:rPr>
           <w:rFonts w:ascii="Courier New" w:eastAsia="Courier New" w:hAnsi="Courier New" w:cs="Courier New"/>
@@ -11229,7 +11485,17 @@
           <w:szCs w:val="22"/>
           <w:lang w:val="en-US" w:eastAsia="en-US"/>
         </w:rPr>
-        <w:t>(Pipeline) issues = throughputFailingPipelines(config);</w:t>
+        <w:t>(</w:t>
+      </w:r>
+      <w:proofErr w:type="gramEnd"/>
+      <w:r>
+        <w:rPr>
+          <w:rFonts w:ascii="Courier New" w:eastAsia="Courier New" w:hAnsi="Courier New" w:cs="Courier New"/>
+          <w:color w:val="auto"/>
+          <w:szCs w:val="22"/>
+          <w:lang w:val="en-US" w:eastAsia="en-US"/>
+        </w:rPr>
+        <w:t>Pipeline) issues = throughputFailingPipelines(config);</w:t>
       </w:r>
     </w:p>
     <w:p>
@@ -11260,6 +11526,7 @@
         </w:rPr>
         <w:t>-&gt;</w:t>
       </w:r>
+      <w:proofErr w:type="gramStart"/>
       <w:r>
         <w:rPr>
           <w:rFonts w:ascii="Courier New" w:eastAsia="Courier New" w:hAnsi="Courier New" w:cs="Courier New"/>
@@ -11287,6 +11554,7 @@
         </w:rPr>
         <w:t>(</w:t>
       </w:r>
+      <w:proofErr w:type="gramEnd"/>
       <w:r>
         <w:rPr>
           <w:rFonts w:ascii="Courier New" w:eastAsia="Courier New" w:hAnsi="Courier New" w:cs="Courier New"/>
@@ -11314,8 +11582,19 @@
           <w:szCs w:val="22"/>
           <w:lang w:val="en-US" w:eastAsia="en-US"/>
         </w:rPr>
-        <w:t xml:space="preserve">     p.capacity</w:t>
-      </w:r>
+        <w:t xml:space="preserve">     </w:t>
+      </w:r>
+      <w:proofErr w:type="gramStart"/>
+      <w:r>
+        <w:rPr>
+          <w:rFonts w:ascii="Courier New" w:eastAsia="Courier New" w:hAnsi="Courier New" w:cs="Courier New"/>
+          <w:color w:val="auto"/>
+          <w:szCs w:val="22"/>
+          <w:lang w:val="en-US" w:eastAsia="en-US"/>
+        </w:rPr>
+        <w:t>p.capacity</w:t>
+      </w:r>
+      <w:proofErr w:type="gramEnd"/>
       <w:r>
         <w:rPr>
           <w:rFonts w:ascii="Courier New" w:eastAsia="Courier New" w:hAnsi="Courier New" w:cs="Courier New"/>
@@ -11364,7 +11643,6 @@
           <w:szCs w:val="22"/>
           <w:lang w:val="en-US" w:eastAsia="en-US"/>
         </w:rPr>
-        <w:lastRenderedPageBreak/>
         <w:t xml:space="preserve">  </w:t>
       </w:r>
       <w:r>
@@ -11384,7 +11662,27 @@
           <w:szCs w:val="22"/>
           <w:lang w:val="en-US" w:eastAsia="en-US"/>
         </w:rPr>
-        <w:t xml:space="preserve"> null != candidate;</w:t>
+        <w:t xml:space="preserve"> </w:t>
+      </w:r>
+      <w:proofErr w:type="gramStart"/>
+      <w:r>
+        <w:rPr>
+          <w:rFonts w:ascii="Courier New" w:eastAsia="Courier New" w:hAnsi="Courier New" w:cs="Courier New"/>
+          <w:color w:val="auto"/>
+          <w:szCs w:val="22"/>
+          <w:lang w:val="en-US" w:eastAsia="en-US"/>
+        </w:rPr>
+        <w:t>null !</w:t>
+      </w:r>
+      <w:proofErr w:type="gramEnd"/>
+      <w:r>
+        <w:rPr>
+          <w:rFonts w:ascii="Courier New" w:eastAsia="Courier New" w:hAnsi="Courier New" w:cs="Courier New"/>
+          <w:color w:val="auto"/>
+          <w:szCs w:val="22"/>
+          <w:lang w:val="en-US" w:eastAsia="en-US"/>
+        </w:rPr>
+        <w:t>= candidate;</w:t>
       </w:r>
     </w:p>
     <w:p>
@@ -11483,7 +11781,27 @@
           <w:szCs w:val="22"/>
           <w:lang w:val="en-US" w:eastAsia="en-US"/>
         </w:rPr>
-        <w:t xml:space="preserve"> changeSingleParameter(candidate, trigger);</w:t>
+        <w:t xml:space="preserve"> </w:t>
+      </w:r>
+      <w:proofErr w:type="gramStart"/>
+      <w:r>
+        <w:rPr>
+          <w:rFonts w:ascii="Courier New" w:eastAsia="Courier New" w:hAnsi="Courier New" w:cs="Courier New"/>
+          <w:color w:val="auto"/>
+          <w:szCs w:val="22"/>
+          <w:lang w:val="en-US" w:eastAsia="en-US"/>
+        </w:rPr>
+        <w:t>changeSingleParameter(</w:t>
+      </w:r>
+      <w:proofErr w:type="gramEnd"/>
+      <w:r>
+        <w:rPr>
+          <w:rFonts w:ascii="Courier New" w:eastAsia="Courier New" w:hAnsi="Courier New" w:cs="Courier New"/>
+          <w:color w:val="auto"/>
+          <w:szCs w:val="22"/>
+          <w:lang w:val="en-US" w:eastAsia="en-US"/>
+        </w:rPr>
+        <w:t>candidate, trigger);</w:t>
       </w:r>
     </w:p>
     <w:p>
@@ -11522,7 +11840,27 @@
           <w:szCs w:val="22"/>
           <w:lang w:val="en-US" w:eastAsia="en-US"/>
         </w:rPr>
-        <w:t xml:space="preserve"> changeSingleAlgorithm(candidate, trigger);</w:t>
+        <w:t xml:space="preserve"> </w:t>
+      </w:r>
+      <w:proofErr w:type="gramStart"/>
+      <w:r>
+        <w:rPr>
+          <w:rFonts w:ascii="Courier New" w:eastAsia="Courier New" w:hAnsi="Courier New" w:cs="Courier New"/>
+          <w:color w:val="auto"/>
+          <w:szCs w:val="22"/>
+          <w:lang w:val="en-US" w:eastAsia="en-US"/>
+        </w:rPr>
+        <w:t>changeSingleAlgorithm(</w:t>
+      </w:r>
+      <w:proofErr w:type="gramEnd"/>
+      <w:r>
+        <w:rPr>
+          <w:rFonts w:ascii="Courier New" w:eastAsia="Courier New" w:hAnsi="Courier New" w:cs="Courier New"/>
+          <w:color w:val="auto"/>
+          <w:szCs w:val="22"/>
+          <w:lang w:val="en-US" w:eastAsia="en-US"/>
+        </w:rPr>
+        <w:t>candidate, trigger);</w:t>
       </w:r>
     </w:p>
     <w:p>
@@ -11579,7 +11917,27 @@
           <w:szCs w:val="22"/>
           <w:lang w:val="en-US" w:eastAsia="en-US"/>
         </w:rPr>
-        <w:t xml:space="preserve"> shedLoad(candidate, trigger);</w:t>
+        <w:t xml:space="preserve"> </w:t>
+      </w:r>
+      <w:proofErr w:type="gramStart"/>
+      <w:r>
+        <w:rPr>
+          <w:rFonts w:ascii="Courier New" w:eastAsia="Courier New" w:hAnsi="Courier New" w:cs="Courier New"/>
+          <w:color w:val="auto"/>
+          <w:szCs w:val="22"/>
+          <w:lang w:val="en-US" w:eastAsia="en-US"/>
+        </w:rPr>
+        <w:t>shedLoad(</w:t>
+      </w:r>
+      <w:proofErr w:type="gramEnd"/>
+      <w:r>
+        <w:rPr>
+          <w:rFonts w:ascii="Courier New" w:eastAsia="Courier New" w:hAnsi="Courier New" w:cs="Courier New"/>
+          <w:color w:val="auto"/>
+          <w:szCs w:val="22"/>
+          <w:lang w:val="en-US" w:eastAsia="en-US"/>
+        </w:rPr>
+        <w:t>candidate, trigger);</w:t>
       </w:r>
     </w:p>
     <w:p>
@@ -11632,6 +11990,7 @@
           <w:lang w:val="en-US" w:eastAsia="en-US"/>
         </w:rPr>
       </w:pPr>
+      <w:proofErr w:type="gramStart"/>
       <w:r>
         <w:rPr>
           <w:rFonts w:ascii="Courier New" w:eastAsia="Courier New" w:hAnsi="Courier New" w:cs="Courier New"/>
@@ -11649,7 +12008,17 @@
           <w:szCs w:val="22"/>
           <w:lang w:val="en-US" w:eastAsia="en-US"/>
         </w:rPr>
-        <w:t>(Pipeline) througputFailingPipelines(QM config) = {</w:t>
+        <w:t>(</w:t>
+      </w:r>
+      <w:proofErr w:type="gramEnd"/>
+      <w:r>
+        <w:rPr>
+          <w:rFonts w:ascii="Courier New" w:eastAsia="Courier New" w:hAnsi="Courier New" w:cs="Courier New"/>
+          <w:color w:val="auto"/>
+          <w:szCs w:val="22"/>
+          <w:lang w:val="en-US" w:eastAsia="en-US"/>
+        </w:rPr>
+        <w:t>Pipeline) througputFailingPipelines(QM config) = {</w:t>
       </w:r>
     </w:p>
     <w:p>
@@ -11669,7 +12038,27 @@
           <w:szCs w:val="22"/>
           <w:lang w:val="en-US" w:eastAsia="en-US"/>
         </w:rPr>
-        <w:t xml:space="preserve">  config.pipelines-&gt; select(p|</w:t>
+        <w:t xml:space="preserve">  </w:t>
+      </w:r>
+      <w:proofErr w:type="gramStart"/>
+      <w:r>
+        <w:rPr>
+          <w:rFonts w:ascii="Courier New" w:eastAsia="Courier New" w:hAnsi="Courier New" w:cs="Courier New"/>
+          <w:color w:val="auto"/>
+          <w:szCs w:val="22"/>
+          <w:lang w:val="en-US" w:eastAsia="en-US"/>
+        </w:rPr>
+        <w:t>config.pipelines</w:t>
+      </w:r>
+      <w:proofErr w:type="gramEnd"/>
+      <w:r>
+        <w:rPr>
+          <w:rFonts w:ascii="Courier New" w:eastAsia="Courier New" w:hAnsi="Courier New" w:cs="Courier New"/>
+          <w:color w:val="auto"/>
+          <w:szCs w:val="22"/>
+          <w:lang w:val="en-US" w:eastAsia="en-US"/>
+        </w:rPr>
+        <w:t>-&gt; select(p|</w:t>
       </w:r>
     </w:p>
     <w:p>
@@ -11689,7 +12078,27 @@
           <w:szCs w:val="22"/>
           <w:lang w:val="en-US" w:eastAsia="en-US"/>
         </w:rPr>
-        <w:t xml:space="preserve">    p.throughput &lt; config.minPipelineThroughput);</w:t>
+        <w:t xml:space="preserve">    </w:t>
+      </w:r>
+      <w:proofErr w:type="gramStart"/>
+      <w:r>
+        <w:rPr>
+          <w:rFonts w:ascii="Courier New" w:eastAsia="Courier New" w:hAnsi="Courier New" w:cs="Courier New"/>
+          <w:color w:val="auto"/>
+          <w:szCs w:val="22"/>
+          <w:lang w:val="en-US" w:eastAsia="en-US"/>
+        </w:rPr>
+        <w:t>p.throughput</w:t>
+      </w:r>
+      <w:proofErr w:type="gramEnd"/>
+      <w:r>
+        <w:rPr>
+          <w:rFonts w:ascii="Courier New" w:eastAsia="Courier New" w:hAnsi="Courier New" w:cs="Courier New"/>
+          <w:color w:val="auto"/>
+          <w:szCs w:val="22"/>
+          <w:lang w:val="en-US" w:eastAsia="en-US"/>
+        </w:rPr>
+        <w:t xml:space="preserve"> &lt; config.minPipelineThroughput);</w:t>
       </w:r>
     </w:p>
     <w:p>
@@ -11820,6 +12229,7 @@
         </w:rPr>
         <w:t xml:space="preserve">  </w:t>
       </w:r>
+      <w:proofErr w:type="gramStart"/>
       <w:r>
         <w:rPr>
           <w:rFonts w:ascii="Courier New" w:eastAsia="Courier New" w:hAnsi="Courier New" w:cs="Courier New"/>
@@ -11837,7 +12247,17 @@
           <w:szCs w:val="22"/>
           <w:lang w:val="en-US" w:eastAsia="en-US"/>
         </w:rPr>
-        <w:t>(Quality) failed = failedQualities(elt);</w:t>
+        <w:t>(</w:t>
+      </w:r>
+      <w:proofErr w:type="gramEnd"/>
+      <w:r>
+        <w:rPr>
+          <w:rFonts w:ascii="Courier New" w:eastAsia="Courier New" w:hAnsi="Courier New" w:cs="Courier New"/>
+          <w:color w:val="auto"/>
+          <w:szCs w:val="22"/>
+          <w:lang w:val="en-US" w:eastAsia="en-US"/>
+        </w:rPr>
+        <w:t>Quality) failed = failedQualities(elt);</w:t>
       </w:r>
     </w:p>
     <w:p>
@@ -11877,7 +12297,27 @@
           <w:szCs w:val="22"/>
           <w:lang w:val="en-US" w:eastAsia="en-US"/>
         </w:rPr>
-        <w:t xml:space="preserve"> failed.isEmpty();</w:t>
+        <w:t xml:space="preserve"> </w:t>
+      </w:r>
+      <w:proofErr w:type="gramStart"/>
+      <w:r>
+        <w:rPr>
+          <w:rFonts w:ascii="Courier New" w:eastAsia="Courier New" w:hAnsi="Courier New" w:cs="Courier New"/>
+          <w:color w:val="auto"/>
+          <w:szCs w:val="22"/>
+          <w:lang w:val="en-US" w:eastAsia="en-US"/>
+        </w:rPr>
+        <w:t>failed.isEmpty</w:t>
+      </w:r>
+      <w:proofErr w:type="gramEnd"/>
+      <w:r>
+        <w:rPr>
+          <w:rFonts w:ascii="Courier New" w:eastAsia="Courier New" w:hAnsi="Courier New" w:cs="Courier New"/>
+          <w:color w:val="auto"/>
+          <w:szCs w:val="22"/>
+          <w:lang w:val="en-US" w:eastAsia="en-US"/>
+        </w:rPr>
+        <w:t>();</w:t>
       </w:r>
     </w:p>
     <w:p>
@@ -11957,7 +12397,27 @@
           <w:szCs w:val="22"/>
           <w:lang w:val="en-US" w:eastAsia="en-US"/>
         </w:rPr>
-        <w:t xml:space="preserve"> (e: utility(e.elt, e.quality) </w:t>
+        <w:t xml:space="preserve"> (e: </w:t>
+      </w:r>
+      <w:proofErr w:type="gramStart"/>
+      <w:r>
+        <w:rPr>
+          <w:rFonts w:ascii="Courier New" w:eastAsia="Courier New" w:hAnsi="Courier New" w:cs="Courier New"/>
+          <w:color w:val="auto"/>
+          <w:szCs w:val="22"/>
+          <w:lang w:val="en-US" w:eastAsia="en-US"/>
+        </w:rPr>
+        <w:t>utility(</w:t>
+      </w:r>
+      <w:proofErr w:type="gramEnd"/>
+      <w:r>
+        <w:rPr>
+          <w:rFonts w:ascii="Courier New" w:eastAsia="Courier New" w:hAnsi="Courier New" w:cs="Courier New"/>
+          <w:color w:val="auto"/>
+          <w:szCs w:val="22"/>
+          <w:lang w:val="en-US" w:eastAsia="en-US"/>
+        </w:rPr>
+        <w:t xml:space="preserve">e.elt, e.quality) </w:t>
       </w:r>
     </w:p>
     <w:p>
@@ -11978,7 +12438,27 @@
           <w:szCs w:val="22"/>
           <w:lang w:val="en-US" w:eastAsia="en-US"/>
         </w:rPr>
-        <w:t xml:space="preserve">      – cost(e.elt, e.quality));</w:t>
+        <w:t xml:space="preserve">      – </w:t>
+      </w:r>
+      <w:proofErr w:type="gramStart"/>
+      <w:r>
+        <w:rPr>
+          <w:rFonts w:ascii="Courier New" w:eastAsia="Courier New" w:hAnsi="Courier New" w:cs="Courier New"/>
+          <w:color w:val="auto"/>
+          <w:szCs w:val="22"/>
+          <w:lang w:val="en-US" w:eastAsia="en-US"/>
+        </w:rPr>
+        <w:t>cost(</w:t>
+      </w:r>
+      <w:proofErr w:type="gramEnd"/>
+      <w:r>
+        <w:rPr>
+          <w:rFonts w:ascii="Courier New" w:eastAsia="Courier New" w:hAnsi="Courier New" w:cs="Courier New"/>
+          <w:color w:val="auto"/>
+          <w:szCs w:val="22"/>
+          <w:lang w:val="en-US" w:eastAsia="en-US"/>
+        </w:rPr>
+        <w:t>e.elt, e.quality));</w:t>
       </w:r>
     </w:p>
     <w:p>
@@ -12001,6 +12481,7 @@
         </w:rPr>
         <w:t xml:space="preserve">    </w:t>
       </w:r>
+      <w:proofErr w:type="gramStart"/>
       <w:r>
         <w:rPr>
           <w:rFonts w:ascii="Courier New" w:eastAsia="Courier New" w:hAnsi="Courier New" w:cs="Courier New"/>
@@ -12018,7 +12499,17 @@
           <w:szCs w:val="22"/>
           <w:lang w:val="en-US" w:eastAsia="en-US"/>
         </w:rPr>
-        <w:t>(Quality q: failed) {</w:t>
+        <w:t>(</w:t>
+      </w:r>
+      <w:proofErr w:type="gramEnd"/>
+      <w:r>
+        <w:rPr>
+          <w:rFonts w:ascii="Courier New" w:eastAsia="Courier New" w:hAnsi="Courier New" w:cs="Courier New"/>
+          <w:color w:val="auto"/>
+          <w:szCs w:val="22"/>
+          <w:lang w:val="en-US" w:eastAsia="en-US"/>
+        </w:rPr>
+        <w:t>Quality q: failed) {</w:t>
       </w:r>
     </w:p>
     <w:p>
@@ -12041,6 +12532,7 @@
         </w:rPr>
         <w:t xml:space="preserve">      </w:t>
       </w:r>
+      <w:proofErr w:type="gramStart"/>
       <w:r>
         <w:rPr>
           <w:rFonts w:ascii="Courier New" w:eastAsia="Courier New" w:hAnsi="Courier New" w:cs="Courier New"/>
@@ -12058,7 +12550,17 @@
           <w:szCs w:val="22"/>
           <w:lang w:val="en-US" w:eastAsia="en-US"/>
         </w:rPr>
-        <w:t>(Parameter p: elt.family.parameter) {</w:t>
+        <w:t>(</w:t>
+      </w:r>
+      <w:proofErr w:type="gramEnd"/>
+      <w:r>
+        <w:rPr>
+          <w:rFonts w:ascii="Courier New" w:eastAsia="Courier New" w:hAnsi="Courier New" w:cs="Courier New"/>
+          <w:color w:val="auto"/>
+          <w:szCs w:val="22"/>
+          <w:lang w:val="en-US" w:eastAsia="en-US"/>
+        </w:rPr>
+        <w:t>Parameter p: elt.family.parameter) {</w:t>
       </w:r>
     </w:p>
     <w:p>
@@ -12098,7 +12600,27 @@
           <w:szCs w:val="22"/>
           <w:lang w:val="en-US" w:eastAsia="en-US"/>
         </w:rPr>
-        <w:t xml:space="preserve"> changeParameter(elt, trigger, p) </w:t>
+        <w:t xml:space="preserve"> </w:t>
+      </w:r>
+      <w:proofErr w:type="gramStart"/>
+      <w:r>
+        <w:rPr>
+          <w:rFonts w:ascii="Courier New" w:eastAsia="Courier New" w:hAnsi="Courier New" w:cs="Courier New"/>
+          <w:color w:val="auto"/>
+          <w:szCs w:val="22"/>
+          <w:lang w:val="en-US" w:eastAsia="en-US"/>
+        </w:rPr>
+        <w:t>changeParameter(</w:t>
+      </w:r>
+      <w:proofErr w:type="gramEnd"/>
+      <w:r>
+        <w:rPr>
+          <w:rFonts w:ascii="Courier New" w:eastAsia="Courier New" w:hAnsi="Courier New" w:cs="Courier New"/>
+          <w:color w:val="auto"/>
+          <w:szCs w:val="22"/>
+          <w:lang w:val="en-US" w:eastAsia="en-US"/>
+        </w:rPr>
+        <w:t xml:space="preserve">elt, trigger, p) </w:t>
       </w:r>
     </w:p>
     <w:p>
@@ -12182,6 +12704,7 @@
         </w:rPr>
         <w:t xml:space="preserve">      </w:t>
       </w:r>
+      <w:proofErr w:type="gramStart"/>
       <w:r>
         <w:rPr>
           <w:rFonts w:ascii="Courier New" w:eastAsia="Courier New" w:hAnsi="Courier New" w:cs="Courier New"/>
@@ -12199,7 +12722,17 @@
           <w:szCs w:val="22"/>
           <w:lang w:val="en-US" w:eastAsia="en-US"/>
         </w:rPr>
-        <w:t>(Algorithm a: elt.family.members) {</w:t>
+        <w:t>(</w:t>
+      </w:r>
+      <w:proofErr w:type="gramEnd"/>
+      <w:r>
+        <w:rPr>
+          <w:rFonts w:ascii="Courier New" w:eastAsia="Courier New" w:hAnsi="Courier New" w:cs="Courier New"/>
+          <w:color w:val="auto"/>
+          <w:szCs w:val="22"/>
+          <w:lang w:val="en-US" w:eastAsia="en-US"/>
+        </w:rPr>
+        <w:t>Algorithm a: elt.family.members) {</w:t>
       </w:r>
     </w:p>
     <w:p>
@@ -12239,7 +12772,27 @@
           <w:szCs w:val="22"/>
           <w:lang w:val="en-US" w:eastAsia="en-US"/>
         </w:rPr>
-        <w:t xml:space="preserve"> changeAlgorithm(elt, trigger, a) </w:t>
+        <w:t xml:space="preserve"> </w:t>
+      </w:r>
+      <w:proofErr w:type="gramStart"/>
+      <w:r>
+        <w:rPr>
+          <w:rFonts w:ascii="Courier New" w:eastAsia="Courier New" w:hAnsi="Courier New" w:cs="Courier New"/>
+          <w:color w:val="auto"/>
+          <w:szCs w:val="22"/>
+          <w:lang w:val="en-US" w:eastAsia="en-US"/>
+        </w:rPr>
+        <w:t>changeAlgorithm(</w:t>
+      </w:r>
+      <w:proofErr w:type="gramEnd"/>
+      <w:r>
+        <w:rPr>
+          <w:rFonts w:ascii="Courier New" w:eastAsia="Courier New" w:hAnsi="Courier New" w:cs="Courier New"/>
+          <w:color w:val="auto"/>
+          <w:szCs w:val="22"/>
+          <w:lang w:val="en-US" w:eastAsia="en-US"/>
+        </w:rPr>
+        <w:t xml:space="preserve">elt, trigger, a) </w:t>
       </w:r>
     </w:p>
     <w:p>
@@ -12381,7 +12934,6 @@
         <w:rPr>
           <w:lang w:val="en-US"/>
         </w:rPr>
-        <w:lastRenderedPageBreak/>
         <w:t>Tactic</w:t>
       </w:r>
       <w:bookmarkEnd w:id="1833"/>
@@ -12541,7 +13093,25 @@
           <w:sz w:val="24"/>
           <w:szCs w:val="24"/>
         </w:rPr>
-        <w:t xml:space="preserve"> for the fail statement). Then the next possible tactic within the same strategy or the next possible strategy is executed. If there is no further tactic or strategy, respectively, the execution of the script terminates with an adaptation failure.</w:t>
+        <w:t xml:space="preserve"> for the </w:t>
+      </w:r>
+      <w:proofErr w:type="gramStart"/>
+      <w:r>
+        <w:rPr>
+          <w:rFonts w:asciiTheme="majorHAnsi" w:hAnsiTheme="majorHAnsi"/>
+          <w:sz w:val="24"/>
+          <w:szCs w:val="24"/>
+        </w:rPr>
+        <w:t>fail</w:t>
+      </w:r>
+      <w:proofErr w:type="gramEnd"/>
+      <w:r>
+        <w:rPr>
+          <w:rFonts w:asciiTheme="majorHAnsi" w:hAnsiTheme="majorHAnsi"/>
+          <w:sz w:val="24"/>
+          <w:szCs w:val="24"/>
+        </w:rPr>
+        <w:t xml:space="preserve"> statement). Then the next possible tactic within the same strategy or the next possible strategy is executed. If there is no further tactic or strategy, respectively, the execution of the script terminates with an adaptation failure.</w:t>
       </w:r>
     </w:p>
     <w:p>
@@ -12808,6 +13378,7 @@
           <w:szCs w:val="22"/>
         </w:rPr>
       </w:pPr>
+      <w:proofErr w:type="gramStart"/>
       <w:r>
         <w:rPr>
           <w:rFonts w:ascii="Courier New" w:eastAsia="Courier New" w:hAnsi="Courier New" w:cs="Courier New"/>
@@ -12822,6 +13393,7 @@
         </w:rPr>
         <w:t>(</w:t>
       </w:r>
+      <w:proofErr w:type="gramEnd"/>
       <w:r>
         <w:rPr>
           <w:rFonts w:ascii="Courier New" w:eastAsia="Courier New" w:hAnsi="Courier New" w:cs="Courier New"/>
@@ -12924,7 +13496,27 @@
           <w:szCs w:val="22"/>
           <w:lang w:val="en-US" w:eastAsia="en-US"/>
         </w:rPr>
-        <w:t xml:space="preserve"> name (ParameterList) post : pre {</w:t>
+        <w:t xml:space="preserve"> name (ParameterList) </w:t>
+      </w:r>
+      <w:proofErr w:type="gramStart"/>
+      <w:r>
+        <w:rPr>
+          <w:rFonts w:ascii="Courier New" w:eastAsia="Courier New" w:hAnsi="Courier New" w:cs="Courier New"/>
+          <w:color w:val="auto"/>
+          <w:szCs w:val="22"/>
+          <w:lang w:val="en-US" w:eastAsia="en-US"/>
+        </w:rPr>
+        <w:t>post :</w:t>
+      </w:r>
+      <w:proofErr w:type="gramEnd"/>
+      <w:r>
+        <w:rPr>
+          <w:rFonts w:ascii="Courier New" w:eastAsia="Courier New" w:hAnsi="Courier New" w:cs="Courier New"/>
+          <w:color w:val="auto"/>
+          <w:szCs w:val="22"/>
+          <w:lang w:val="en-US" w:eastAsia="en-US"/>
+        </w:rPr>
+        <w:t xml:space="preserve"> pre {</w:t>
       </w:r>
     </w:p>
     <w:p>
@@ -13141,7 +13733,6 @@
           <w:sz w:val="24"/>
           <w:szCs w:val="24"/>
         </w:rPr>
-        <w:lastRenderedPageBreak/>
         <w:t xml:space="preserve">The </w:t>
       </w:r>
       <w:r>
@@ -13370,7 +13961,23 @@
           <w:rFonts w:ascii="Courier New" w:eastAsia="Courier New" w:hAnsi="Courier New" w:cs="Courier New"/>
           <w:szCs w:val="22"/>
         </w:rPr>
-        <w:t>Algorithm newAlgorithm) : {</w:t>
+        <w:t>Algorithm newAlgorithm</w:t>
+      </w:r>
+      <w:proofErr w:type="gramStart"/>
+      <w:r>
+        <w:rPr>
+          <w:rFonts w:ascii="Courier New" w:eastAsia="Courier New" w:hAnsi="Courier New" w:cs="Courier New"/>
+          <w:szCs w:val="22"/>
+        </w:rPr>
+        <w:t>) :</w:t>
+      </w:r>
+      <w:proofErr w:type="gramEnd"/>
+      <w:r>
+        <w:rPr>
+          <w:rFonts w:ascii="Courier New" w:eastAsia="Courier New" w:hAnsi="Courier New" w:cs="Courier New"/>
+          <w:szCs w:val="22"/>
+        </w:rPr>
+        <w:t xml:space="preserve"> {</w:t>
       </w:r>
     </w:p>
     <w:p>
@@ -13391,7 +13998,27 @@
           <w:szCs w:val="22"/>
           <w:lang w:val="en-US" w:eastAsia="en-US"/>
         </w:rPr>
-        <w:t xml:space="preserve">  Algorithm current = elt.family.current;</w:t>
+        <w:t xml:space="preserve">  Algorithm current = </w:t>
+      </w:r>
+      <w:proofErr w:type="gramStart"/>
+      <w:r>
+        <w:rPr>
+          <w:rFonts w:ascii="Courier New" w:eastAsia="Courier New" w:hAnsi="Courier New" w:cs="Courier New"/>
+          <w:color w:val="auto"/>
+          <w:szCs w:val="22"/>
+          <w:lang w:val="en-US" w:eastAsia="en-US"/>
+        </w:rPr>
+        <w:t>elt.family</w:t>
+      </w:r>
+      <w:proofErr w:type="gramEnd"/>
+      <w:r>
+        <w:rPr>
+          <w:rFonts w:ascii="Courier New" w:eastAsia="Courier New" w:hAnsi="Courier New" w:cs="Courier New"/>
+          <w:color w:val="auto"/>
+          <w:szCs w:val="22"/>
+          <w:lang w:val="en-US" w:eastAsia="en-US"/>
+        </w:rPr>
+        <w:t>.current;</w:t>
       </w:r>
     </w:p>
     <w:p>
@@ -13435,6 +14062,7 @@
         </w:rPr>
         <w:t xml:space="preserve">  </w:t>
       </w:r>
+      <w:proofErr w:type="gramStart"/>
       <w:r>
         <w:rPr>
           <w:rFonts w:ascii="Courier New" w:eastAsia="Courier New" w:hAnsi="Courier New" w:cs="Courier New"/>
@@ -13452,7 +14080,17 @@
           <w:szCs w:val="22"/>
           <w:lang w:val="en-US" w:eastAsia="en-US"/>
         </w:rPr>
-        <w:t>(Parameter p: elt.family) {</w:t>
+        <w:t>(</w:t>
+      </w:r>
+      <w:proofErr w:type="gramEnd"/>
+      <w:r>
+        <w:rPr>
+          <w:rFonts w:ascii="Courier New" w:eastAsia="Courier New" w:hAnsi="Courier New" w:cs="Courier New"/>
+          <w:color w:val="auto"/>
+          <w:szCs w:val="22"/>
+          <w:lang w:val="en-US" w:eastAsia="en-US"/>
+        </w:rPr>
+        <w:t>Parameter p: elt.family) {</w:t>
       </w:r>
     </w:p>
     <w:p>
@@ -13473,8 +14111,19 @@
           <w:szCs w:val="22"/>
           <w:lang w:val="en-US" w:eastAsia="en-US"/>
         </w:rPr>
-        <w:t xml:space="preserve">    newAlgorithm.algorithm.parameter</w:t>
-      </w:r>
+        <w:t xml:space="preserve">    </w:t>
+      </w:r>
+      <w:proofErr w:type="gramStart"/>
+      <w:r>
+        <w:rPr>
+          <w:rFonts w:ascii="Courier New" w:eastAsia="Courier New" w:hAnsi="Courier New" w:cs="Courier New"/>
+          <w:color w:val="auto"/>
+          <w:szCs w:val="22"/>
+          <w:lang w:val="en-US" w:eastAsia="en-US"/>
+        </w:rPr>
+        <w:t>newAlgorithm.algorithm.parameter</w:t>
+      </w:r>
+      <w:proofErr w:type="gramEnd"/>
     </w:p>
     <w:p>
       <w:pPr>
@@ -13494,7 +14143,27 @@
           <w:szCs w:val="22"/>
           <w:lang w:val="en-US" w:eastAsia="en-US"/>
         </w:rPr>
-        <w:t xml:space="preserve">      -&gt;select(q|q.name == p.name).first()</w:t>
+        <w:t xml:space="preserve">      -&gt;</w:t>
+      </w:r>
+      <w:proofErr w:type="gramStart"/>
+      <w:r>
+        <w:rPr>
+          <w:rFonts w:ascii="Courier New" w:eastAsia="Courier New" w:hAnsi="Courier New" w:cs="Courier New"/>
+          <w:color w:val="auto"/>
+          <w:szCs w:val="22"/>
+          <w:lang w:val="en-US" w:eastAsia="en-US"/>
+        </w:rPr>
+        <w:t>select(</w:t>
+      </w:r>
+      <w:proofErr w:type="gramEnd"/>
+      <w:r>
+        <w:rPr>
+          <w:rFonts w:ascii="Courier New" w:eastAsia="Courier New" w:hAnsi="Courier New" w:cs="Courier New"/>
+          <w:color w:val="auto"/>
+          <w:szCs w:val="22"/>
+          <w:lang w:val="en-US" w:eastAsia="en-US"/>
+        </w:rPr>
+        <w:t>q|q.name == p.name).first()</w:t>
       </w:r>
     </w:p>
     <w:p>
@@ -13517,14 +14186,25 @@
         </w:rPr>
         <w:t xml:space="preserve">         </w:t>
       </w:r>
-      <w:r>
-        <w:rPr>
-          <w:rFonts w:ascii="Courier New" w:eastAsia="Courier New" w:hAnsi="Courier New" w:cs="Courier New"/>
-          <w:color w:val="auto"/>
-          <w:szCs w:val="22"/>
-          <w:lang w:val="en-US" w:eastAsia="en-US"/>
-        </w:rPr>
-        <w:t>.setValue(p.value);</w:t>
+      <w:proofErr w:type="gramStart"/>
+      <w:r>
+        <w:rPr>
+          <w:rFonts w:ascii="Courier New" w:eastAsia="Courier New" w:hAnsi="Courier New" w:cs="Courier New"/>
+          <w:color w:val="auto"/>
+          <w:szCs w:val="22"/>
+          <w:lang w:val="en-US" w:eastAsia="en-US"/>
+        </w:rPr>
+        <w:t>.setValue</w:t>
+      </w:r>
+      <w:proofErr w:type="gramEnd"/>
+      <w:r>
+        <w:rPr>
+          <w:rFonts w:ascii="Courier New" w:eastAsia="Courier New" w:hAnsi="Courier New" w:cs="Courier New"/>
+          <w:color w:val="auto"/>
+          <w:szCs w:val="22"/>
+          <w:lang w:val="en-US" w:eastAsia="en-US"/>
+        </w:rPr>
+        <w:t>(p.value);</w:t>
       </w:r>
     </w:p>
     <w:p>
@@ -13587,8 +14267,19 @@
           <w:szCs w:val="22"/>
           <w:lang w:val="en-US" w:eastAsia="en-US"/>
         </w:rPr>
-        <w:t xml:space="preserve">  elt.family</w:t>
-      </w:r>
+        <w:t xml:space="preserve">  </w:t>
+      </w:r>
+      <w:proofErr w:type="gramStart"/>
+      <w:r>
+        <w:rPr>
+          <w:rFonts w:ascii="Courier New" w:eastAsia="Courier New" w:hAnsi="Courier New" w:cs="Courier New"/>
+          <w:color w:val="auto"/>
+          <w:szCs w:val="22"/>
+          <w:lang w:val="en-US" w:eastAsia="en-US"/>
+        </w:rPr>
+        <w:t>elt.family</w:t>
+      </w:r>
+      <w:proofErr w:type="gramEnd"/>
       <w:r>
         <w:rPr>
           <w:rFonts w:ascii="Courier New" w:eastAsia="Courier New" w:hAnsi="Courier New" w:cs="Courier New"/>
@@ -13674,6 +14365,7 @@
         </w:rPr>
         <w:t xml:space="preserve">Adaptation strategies or tactics may determine that they cannot proceed and that another (less important) strategy or tactic in the same context shall take over. This can be achieved using the </w:t>
       </w:r>
+      <w:proofErr w:type="gramStart"/>
       <w:r>
         <w:rPr>
           <w:rFonts w:ascii="Courier New" w:hAnsi="Courier New" w:cs="Courier New"/>
@@ -13684,6 +14376,7 @@
         </w:rPr>
         <w:t>fail</w:t>
       </w:r>
+      <w:proofErr w:type="gramEnd"/>
       <w:r>
         <w:rPr>
           <w:lang w:val="en-GB"/>
@@ -13792,7 +14485,21 @@
         <w:rPr>
           <w:lang w:val="en-GB"/>
         </w:rPr>
-        <w:t xml:space="preserve"> can be used within blocks, e.g., alternatives to express a conditional fail.</w:t>
+        <w:t xml:space="preserve"> can be used within blocks, e.g., alternatives to express a conditional </w:t>
+      </w:r>
+      <w:proofErr w:type="gramStart"/>
+      <w:r>
+        <w:rPr>
+          <w:lang w:val="en-GB"/>
+        </w:rPr>
+        <w:t>fail</w:t>
+      </w:r>
+      <w:proofErr w:type="gramEnd"/>
+      <w:r>
+        <w:rPr>
+          <w:lang w:val="en-GB"/>
+        </w:rPr>
+        <w:t>.</w:t>
       </w:r>
     </w:p>
     <w:p>
@@ -13832,6 +14539,7 @@
           <w:lang w:val="en-US"/>
         </w:rPr>
       </w:pPr>
+      <w:proofErr w:type="gramStart"/>
       <w:r>
         <w:rPr>
           <w:rFonts w:ascii="Courier New" w:eastAsia="Times New Roman" w:hAnsi="Courier New" w:cs="Courier New"/>
@@ -13839,7 +14547,6 @@
           <w:szCs w:val="22"/>
           <w:lang w:val="en-US"/>
         </w:rPr>
-        <w:lastRenderedPageBreak/>
         <w:t xml:space="preserve">fail </w:t>
       </w:r>
       <w:r>
@@ -13848,7 +14555,16 @@
           <w:szCs w:val="22"/>
           <w:lang w:val="en-US"/>
         </w:rPr>
-        <w:t xml:space="preserve">”reason”? </w:t>
+        <w:t>”reason</w:t>
+      </w:r>
+      <w:proofErr w:type="gramEnd"/>
+      <w:r>
+        <w:rPr>
+          <w:rFonts w:ascii="Courier New" w:eastAsia="Times New Roman" w:hAnsi="Courier New" w:cs="Courier New"/>
+          <w:szCs w:val="22"/>
+          <w:lang w:val="en-US"/>
+        </w:rPr>
+        <w:t xml:space="preserve">”? </w:t>
       </w:r>
       <w:r>
         <w:rPr>
@@ -14134,7 +14850,25 @@
           <w:sz w:val="24"/>
           <w:szCs w:val="24"/>
         </w:rPr>
-        <w:t>that a strategy or tactic shall immediately fail with the reason of the previous fail. If there was no previous fail, then refail does not have an effect. This statement can be used only within tactics or strategies (post processing part)</w:t>
+        <w:t xml:space="preserve">that a strategy or tactic shall immediately fail with the reason of the previous </w:t>
+      </w:r>
+      <w:proofErr w:type="gramStart"/>
+      <w:r>
+        <w:rPr>
+          <w:rFonts w:asciiTheme="majorHAnsi" w:hAnsiTheme="majorHAnsi"/>
+          <w:sz w:val="24"/>
+          <w:szCs w:val="24"/>
+        </w:rPr>
+        <w:t>fail</w:t>
+      </w:r>
+      <w:proofErr w:type="gramEnd"/>
+      <w:r>
+        <w:rPr>
+          <w:rFonts w:asciiTheme="majorHAnsi" w:hAnsiTheme="majorHAnsi"/>
+          <w:sz w:val="24"/>
+          <w:szCs w:val="24"/>
+        </w:rPr>
+        <w:t>. If there was no previous fail, then refail does not have an effect. This statement can be used only within tactics or strategies (post processing part)</w:t>
       </w:r>
       <w:r>
         <w:rPr>
@@ -14389,7 +15123,27 @@
           <w:szCs w:val="22"/>
           <w:lang w:val="en-US" w:eastAsia="en-US"/>
         </w:rPr>
-        <w:t>Algorithm newAlgorithm) : {</w:t>
+        <w:t>Algorithm newAlgorithm</w:t>
+      </w:r>
+      <w:proofErr w:type="gramStart"/>
+      <w:r>
+        <w:rPr>
+          <w:rFonts w:ascii="Courier New" w:eastAsia="Courier New" w:hAnsi="Courier New" w:cs="Courier New"/>
+          <w:color w:val="auto"/>
+          <w:szCs w:val="22"/>
+          <w:lang w:val="en-US" w:eastAsia="en-US"/>
+        </w:rPr>
+        <w:t>) :</w:t>
+      </w:r>
+      <w:proofErr w:type="gramEnd"/>
+      <w:r>
+        <w:rPr>
+          <w:rFonts w:ascii="Courier New" w:eastAsia="Courier New" w:hAnsi="Courier New" w:cs="Courier New"/>
+          <w:color w:val="auto"/>
+          <w:szCs w:val="22"/>
+          <w:lang w:val="en-US" w:eastAsia="en-US"/>
+        </w:rPr>
+        <w:t xml:space="preserve"> {</w:t>
       </w:r>
     </w:p>
     <w:p>
@@ -14470,7 +15224,27 @@
           <w:szCs w:val="22"/>
           <w:lang w:val="en-US" w:eastAsia="en-US"/>
         </w:rPr>
-        <w:t>f (!algorithmFound) {</w:t>
+        <w:t xml:space="preserve">f </w:t>
+      </w:r>
+      <w:proofErr w:type="gramStart"/>
+      <w:r>
+        <w:rPr>
+          <w:rFonts w:ascii="Courier New" w:eastAsia="Courier New" w:hAnsi="Courier New" w:cs="Courier New"/>
+          <w:color w:val="auto"/>
+          <w:szCs w:val="22"/>
+          <w:lang w:val="en-US" w:eastAsia="en-US"/>
+        </w:rPr>
+        <w:t>(!algorithmFound</w:t>
+      </w:r>
+      <w:proofErr w:type="gramEnd"/>
+      <w:r>
+        <w:rPr>
+          <w:rFonts w:ascii="Courier New" w:eastAsia="Courier New" w:hAnsi="Courier New" w:cs="Courier New"/>
+          <w:color w:val="auto"/>
+          <w:szCs w:val="22"/>
+          <w:lang w:val="en-US" w:eastAsia="en-US"/>
+        </w:rPr>
+        <w:t>) {</w:t>
       </w:r>
     </w:p>
     <w:p>
@@ -14493,6 +15267,7 @@
         </w:rPr>
         <w:t xml:space="preserve">    </w:t>
       </w:r>
+      <w:proofErr w:type="gramStart"/>
       <w:r>
         <w:rPr>
           <w:rFonts w:ascii="Courier New" w:eastAsia="Courier New" w:hAnsi="Courier New" w:cs="Courier New"/>
@@ -14519,7 +15294,17 @@
           <w:szCs w:val="22"/>
           <w:lang w:val="en-US" w:eastAsia="en-US"/>
         </w:rPr>
-        <w:t>no algorithm found” 123;</w:t>
+        <w:t>no</w:t>
+      </w:r>
+      <w:proofErr w:type="gramEnd"/>
+      <w:r>
+        <w:rPr>
+          <w:rFonts w:ascii="Courier New" w:eastAsia="Courier New" w:hAnsi="Courier New" w:cs="Courier New"/>
+          <w:color w:val="auto"/>
+          <w:szCs w:val="22"/>
+          <w:lang w:val="en-US" w:eastAsia="en-US"/>
+        </w:rPr>
+        <w:t xml:space="preserve"> algorithm found” 123;</w:t>
       </w:r>
     </w:p>
     <w:p>
@@ -14743,14 +15528,25 @@
         </w:rPr>
         <w:t>trigger</w:t>
       </w:r>
-      <w:r>
-        <w:rPr>
-          <w:rFonts w:ascii="Courier New" w:eastAsia="Courier New" w:hAnsi="Courier New" w:cs="Courier New"/>
-          <w:color w:val="auto"/>
-          <w:szCs w:val="22"/>
-          <w:lang w:val="en-US" w:eastAsia="en-US"/>
-        </w:rPr>
-        <w:t>) : {</w:t>
+      <w:proofErr w:type="gramStart"/>
+      <w:r>
+        <w:rPr>
+          <w:rFonts w:ascii="Courier New" w:eastAsia="Courier New" w:hAnsi="Courier New" w:cs="Courier New"/>
+          <w:color w:val="auto"/>
+          <w:szCs w:val="22"/>
+          <w:lang w:val="en-US" w:eastAsia="en-US"/>
+        </w:rPr>
+        <w:t>) :</w:t>
+      </w:r>
+      <w:proofErr w:type="gramEnd"/>
+      <w:r>
+        <w:rPr>
+          <w:rFonts w:ascii="Courier New" w:eastAsia="Courier New" w:hAnsi="Courier New" w:cs="Courier New"/>
+          <w:color w:val="auto"/>
+          <w:szCs w:val="22"/>
+          <w:lang w:val="en-US" w:eastAsia="en-US"/>
+        </w:rPr>
+        <w:t xml:space="preserve"> {</w:t>
       </w:r>
     </w:p>
     <w:p>
@@ -14943,14 +15739,25 @@
         </w:rPr>
         <w:t>trigger</w:t>
       </w:r>
-      <w:r>
-        <w:rPr>
-          <w:rFonts w:ascii="Courier New" w:eastAsia="Courier New" w:hAnsi="Courier New" w:cs="Courier New"/>
-          <w:color w:val="auto"/>
-          <w:szCs w:val="22"/>
-          <w:lang w:val="en-US" w:eastAsia="en-US"/>
-        </w:rPr>
-        <w:t>) : {</w:t>
+      <w:proofErr w:type="gramStart"/>
+      <w:r>
+        <w:rPr>
+          <w:rFonts w:ascii="Courier New" w:eastAsia="Courier New" w:hAnsi="Courier New" w:cs="Courier New"/>
+          <w:color w:val="auto"/>
+          <w:szCs w:val="22"/>
+          <w:lang w:val="en-US" w:eastAsia="en-US"/>
+        </w:rPr>
+        <w:t>) :</w:t>
+      </w:r>
+      <w:proofErr w:type="gramEnd"/>
+      <w:r>
+        <w:rPr>
+          <w:rFonts w:ascii="Courier New" w:eastAsia="Courier New" w:hAnsi="Courier New" w:cs="Courier New"/>
+          <w:color w:val="auto"/>
+          <w:szCs w:val="22"/>
+          <w:lang w:val="en-US" w:eastAsia="en-US"/>
+        </w:rPr>
+        <w:t xml:space="preserve"> {</w:t>
       </w:r>
     </w:p>
     <w:p>
@@ -15000,7 +15807,6 @@
           <w:szCs w:val="22"/>
           <w:lang w:val="en-US" w:eastAsia="en-US"/>
         </w:rPr>
-        <w:lastRenderedPageBreak/>
         <w:t>}</w:t>
       </w:r>
     </w:p>
@@ -15089,14 +15895,25 @@
           <w:lang w:val="en-US" w:eastAsia="en-US"/>
         </w:rPr>
       </w:pPr>
-      <w:r>
-        <w:rPr>
-          <w:rFonts w:ascii="Courier New" w:eastAsia="Courier New" w:hAnsi="Courier New" w:cs="Courier New"/>
-          <w:color w:val="auto"/>
-          <w:szCs w:val="22"/>
-          <w:lang w:val="en-US" w:eastAsia="en-US"/>
-        </w:rPr>
-        <w:t>update(Strategy strategy</w:t>
+      <w:proofErr w:type="gramStart"/>
+      <w:r>
+        <w:rPr>
+          <w:rFonts w:ascii="Courier New" w:eastAsia="Courier New" w:hAnsi="Courier New" w:cs="Courier New"/>
+          <w:color w:val="auto"/>
+          <w:szCs w:val="22"/>
+          <w:lang w:val="en-US" w:eastAsia="en-US"/>
+        </w:rPr>
+        <w:t>update(</w:t>
+      </w:r>
+      <w:proofErr w:type="gramEnd"/>
+      <w:r>
+        <w:rPr>
+          <w:rFonts w:ascii="Courier New" w:eastAsia="Courier New" w:hAnsi="Courier New" w:cs="Courier New"/>
+          <w:color w:val="auto"/>
+          <w:szCs w:val="22"/>
+          <w:lang w:val="en-US" w:eastAsia="en-US"/>
+        </w:rPr>
+        <w:t>Strategy strategy</w:t>
       </w:r>
       <w:r>
         <w:rPr>
@@ -15128,14 +15945,25 @@
           <w:lang w:val="en-US" w:eastAsia="en-US"/>
         </w:rPr>
       </w:pPr>
-      <w:r>
-        <w:rPr>
-          <w:rFonts w:ascii="Courier New" w:eastAsia="Courier New" w:hAnsi="Courier New" w:cs="Courier New"/>
-          <w:color w:val="auto"/>
-          <w:szCs w:val="22"/>
-          <w:lang w:val="en-US" w:eastAsia="en-US"/>
-        </w:rPr>
-        <w:t>update(Tactic tactic</w:t>
+      <w:proofErr w:type="gramStart"/>
+      <w:r>
+        <w:rPr>
+          <w:rFonts w:ascii="Courier New" w:eastAsia="Courier New" w:hAnsi="Courier New" w:cs="Courier New"/>
+          <w:color w:val="auto"/>
+          <w:szCs w:val="22"/>
+          <w:lang w:val="en-US" w:eastAsia="en-US"/>
+        </w:rPr>
+        <w:t>update(</w:t>
+      </w:r>
+      <w:proofErr w:type="gramEnd"/>
+      <w:r>
+        <w:rPr>
+          <w:rFonts w:ascii="Courier New" w:eastAsia="Courier New" w:hAnsi="Courier New" w:cs="Courier New"/>
+          <w:color w:val="auto"/>
+          <w:szCs w:val="22"/>
+          <w:lang w:val="en-US" w:eastAsia="en-US"/>
+        </w:rPr>
+        <w:t>Tactic tactic</w:t>
       </w:r>
       <w:r>
         <w:rPr>
@@ -15208,14 +16036,25 @@
           <w:lang w:val="en-US"/>
         </w:rPr>
       </w:pPr>
-      <w:r>
-        <w:rPr>
-          <w:rFonts w:ascii="Courier New" w:eastAsia="Courier New" w:hAnsi="Courier New" w:cs="Courier New"/>
-          <w:color w:val="auto"/>
-          <w:szCs w:val="22"/>
-          <w:lang w:val="en-US" w:eastAsia="en-US"/>
-        </w:rPr>
-        <w:t xml:space="preserve">enact(Project source, Configuration </w:t>
+      <w:proofErr w:type="gramStart"/>
+      <w:r>
+        <w:rPr>
+          <w:rFonts w:ascii="Courier New" w:eastAsia="Courier New" w:hAnsi="Courier New" w:cs="Courier New"/>
+          <w:color w:val="auto"/>
+          <w:szCs w:val="22"/>
+          <w:lang w:val="en-US" w:eastAsia="en-US"/>
+        </w:rPr>
+        <w:t>enact(</w:t>
+      </w:r>
+      <w:proofErr w:type="gramEnd"/>
+      <w:r>
+        <w:rPr>
+          <w:rFonts w:ascii="Courier New" w:eastAsia="Courier New" w:hAnsi="Courier New" w:cs="Courier New"/>
+          <w:color w:val="auto"/>
+          <w:szCs w:val="22"/>
+          <w:lang w:val="en-US" w:eastAsia="en-US"/>
+        </w:rPr>
+        <w:t xml:space="preserve">Project source, Configuration </w:t>
       </w:r>
       <w:r>
         <w:rPr>
@@ -15442,8 +16281,9 @@
           <w:szCs w:val="22"/>
           <w:lang w:val="en-US" w:eastAsia="en-US"/>
         </w:rPr>
-        <w:t xml:space="preserve">  QM changed = config.selectChanged</w:t>
-      </w:r>
+        <w:t xml:space="preserve">  QM changed = </w:t>
+      </w:r>
+      <w:proofErr w:type="gramStart"/>
       <w:r>
         <w:rPr>
           <w:rFonts w:ascii="Courier New" w:eastAsia="Times New Roman" w:hAnsi="Courier New" w:cs="Courier New"/>
@@ -15451,8 +16291,18 @@
           <w:szCs w:val="22"/>
           <w:lang w:val="en-US" w:eastAsia="en-US"/>
         </w:rPr>
+        <w:t>config.selectChanged</w:t>
+      </w:r>
+      <w:r>
+        <w:rPr>
+          <w:rFonts w:ascii="Courier New" w:eastAsia="Times New Roman" w:hAnsi="Courier New" w:cs="Courier New"/>
+          <w:color w:val="auto"/>
+          <w:szCs w:val="22"/>
+          <w:lang w:val="en-US" w:eastAsia="en-US"/>
+        </w:rPr>
         <w:t>WithContext</w:t>
       </w:r>
+      <w:proofErr w:type="gramEnd"/>
       <w:r>
         <w:rPr>
           <w:rFonts w:ascii="Courier New" w:eastAsia="Times New Roman" w:hAnsi="Courier New" w:cs="Courier New"/>
@@ -15481,7 +16331,27 @@
           <w:szCs w:val="22"/>
           <w:lang w:val="en-US" w:eastAsia="en-US"/>
         </w:rPr>
-        <w:t xml:space="preserve">  map(Pipeline p: changed.pipelines) {</w:t>
+        <w:t xml:space="preserve">  </w:t>
+      </w:r>
+      <w:proofErr w:type="gramStart"/>
+      <w:r>
+        <w:rPr>
+          <w:rFonts w:ascii="Courier New" w:eastAsia="Times New Roman" w:hAnsi="Courier New" w:cs="Courier New"/>
+          <w:color w:val="auto"/>
+          <w:szCs w:val="22"/>
+          <w:lang w:val="en-US" w:eastAsia="en-US"/>
+        </w:rPr>
+        <w:t>map(</w:t>
+      </w:r>
+      <w:proofErr w:type="gramEnd"/>
+      <w:r>
+        <w:rPr>
+          <w:rFonts w:ascii="Courier New" w:eastAsia="Times New Roman" w:hAnsi="Courier New" w:cs="Courier New"/>
+          <w:color w:val="auto"/>
+          <w:szCs w:val="22"/>
+          <w:lang w:val="en-US" w:eastAsia="en-US"/>
+        </w:rPr>
+        <w:t>Pipeline p: changed.pipelines) {</w:t>
       </w:r>
     </w:p>
     <w:p>
@@ -15502,7 +16372,27 @@
           <w:szCs w:val="22"/>
           <w:lang w:val="en-US" w:eastAsia="en-US"/>
         </w:rPr>
-        <w:t xml:space="preserve">    map(Source s: p.sources) {</w:t>
+        <w:t xml:space="preserve">    </w:t>
+      </w:r>
+      <w:proofErr w:type="gramStart"/>
+      <w:r>
+        <w:rPr>
+          <w:rFonts w:ascii="Courier New" w:eastAsia="Times New Roman" w:hAnsi="Courier New" w:cs="Courier New"/>
+          <w:color w:val="auto"/>
+          <w:szCs w:val="22"/>
+          <w:lang w:val="en-US" w:eastAsia="en-US"/>
+        </w:rPr>
+        <w:t>map(</w:t>
+      </w:r>
+      <w:proofErr w:type="gramEnd"/>
+      <w:r>
+        <w:rPr>
+          <w:rFonts w:ascii="Courier New" w:eastAsia="Times New Roman" w:hAnsi="Courier New" w:cs="Courier New"/>
+          <w:color w:val="auto"/>
+          <w:szCs w:val="22"/>
+          <w:lang w:val="en-US" w:eastAsia="en-US"/>
+        </w:rPr>
+        <w:t>Source s: p.sources) {</w:t>
       </w:r>
     </w:p>
     <w:p>
@@ -15523,7 +16413,27 @@
           <w:szCs w:val="22"/>
           <w:lang w:val="en-US" w:eastAsia="en-US"/>
         </w:rPr>
-        <w:t xml:space="preserve">      enact(p, s);</w:t>
+        <w:t xml:space="preserve">      </w:t>
+      </w:r>
+      <w:proofErr w:type="gramStart"/>
+      <w:r>
+        <w:rPr>
+          <w:rFonts w:ascii="Courier New" w:eastAsia="Times New Roman" w:hAnsi="Courier New" w:cs="Courier New"/>
+          <w:color w:val="auto"/>
+          <w:szCs w:val="22"/>
+          <w:lang w:val="en-US" w:eastAsia="en-US"/>
+        </w:rPr>
+        <w:t>enact(</w:t>
+      </w:r>
+      <w:proofErr w:type="gramEnd"/>
+      <w:r>
+        <w:rPr>
+          <w:rFonts w:ascii="Courier New" w:eastAsia="Times New Roman" w:hAnsi="Courier New" w:cs="Courier New"/>
+          <w:color w:val="auto"/>
+          <w:szCs w:val="22"/>
+          <w:lang w:val="en-US" w:eastAsia="en-US"/>
+        </w:rPr>
+        <w:t>p, s);</w:t>
       </w:r>
     </w:p>
     <w:p>
@@ -15600,6 +16510,7 @@
           <w:lang w:val="en-US" w:eastAsia="en-US"/>
         </w:rPr>
       </w:pPr>
+      <w:proofErr w:type="gramStart"/>
       <w:r>
         <w:rPr>
           <w:rFonts w:ascii="Courier New" w:eastAsia="Times New Roman" w:hAnsi="Courier New" w:cs="Courier New"/>
@@ -15607,7 +16518,17 @@
           <w:szCs w:val="22"/>
           <w:lang w:val="en-US" w:eastAsia="en-US"/>
         </w:rPr>
-        <w:t>enact(Pipeline pipeline, PipelineElement elt) {</w:t>
+        <w:t>enact(</w:t>
+      </w:r>
+      <w:proofErr w:type="gramEnd"/>
+      <w:r>
+        <w:rPr>
+          <w:rFonts w:ascii="Courier New" w:eastAsia="Times New Roman" w:hAnsi="Courier New" w:cs="Courier New"/>
+          <w:color w:val="auto"/>
+          <w:szCs w:val="22"/>
+          <w:lang w:val="en-US" w:eastAsia="en-US"/>
+        </w:rPr>
+        <w:t>Pipeline pipeline, PipelineElement elt) {</w:t>
       </w:r>
     </w:p>
     <w:p>
@@ -15624,7 +16545,6 @@
           <w:rFonts w:ascii="Courier New" w:hAnsi="Courier New" w:cs="Courier New"/>
           <w:szCs w:val="22"/>
         </w:rPr>
-        <w:lastRenderedPageBreak/>
         <w:t xml:space="preserve">  // dynamic dispatch default – do nothing</w:t>
       </w:r>
     </w:p>
@@ -15681,6 +16601,7 @@
           <w:lang w:val="en-US" w:eastAsia="en-US"/>
         </w:rPr>
       </w:pPr>
+      <w:proofErr w:type="gramStart"/>
       <w:r>
         <w:rPr>
           <w:rFonts w:ascii="Courier New" w:eastAsia="Times New Roman" w:hAnsi="Courier New" w:cs="Courier New"/>
@@ -15688,7 +16609,17 @@
           <w:szCs w:val="22"/>
           <w:lang w:val="en-US" w:eastAsia="en-US"/>
         </w:rPr>
-        <w:t>enact(Pipeline pipeline, FamilyElement elt) {</w:t>
+        <w:t>enact(</w:t>
+      </w:r>
+      <w:proofErr w:type="gramEnd"/>
+      <w:r>
+        <w:rPr>
+          <w:rFonts w:ascii="Courier New" w:eastAsia="Times New Roman" w:hAnsi="Courier New" w:cs="Courier New"/>
+          <w:color w:val="auto"/>
+          <w:szCs w:val="22"/>
+          <w:lang w:val="en-US" w:eastAsia="en-US"/>
+        </w:rPr>
+        <w:t>Pipeline pipeline, FamilyElement elt) {</w:t>
       </w:r>
     </w:p>
     <w:p>
@@ -15709,7 +16640,27 @@
           <w:szCs w:val="22"/>
           <w:lang w:val="en-US" w:eastAsia="en-US"/>
         </w:rPr>
-        <w:t xml:space="preserve">  Family family = elt.family;</w:t>
+        <w:t xml:space="preserve">  Family family = </w:t>
+      </w:r>
+      <w:proofErr w:type="gramStart"/>
+      <w:r>
+        <w:rPr>
+          <w:rFonts w:ascii="Courier New" w:eastAsia="Times New Roman" w:hAnsi="Courier New" w:cs="Courier New"/>
+          <w:color w:val="auto"/>
+          <w:szCs w:val="22"/>
+          <w:lang w:val="en-US" w:eastAsia="en-US"/>
+        </w:rPr>
+        <w:t>elt.family</w:t>
+      </w:r>
+      <w:proofErr w:type="gramEnd"/>
+      <w:r>
+        <w:rPr>
+          <w:rFonts w:ascii="Courier New" w:eastAsia="Times New Roman" w:hAnsi="Courier New" w:cs="Courier New"/>
+          <w:color w:val="auto"/>
+          <w:szCs w:val="22"/>
+          <w:lang w:val="en-US" w:eastAsia="en-US"/>
+        </w:rPr>
+        <w:t>;</w:t>
       </w:r>
     </w:p>
     <w:p>
@@ -15730,7 +16681,27 @@
           <w:szCs w:val="22"/>
           <w:lang w:val="en-US" w:eastAsia="en-US"/>
         </w:rPr>
-        <w:t xml:space="preserve">  CommandSequence cmd = new CommandSequence();</w:t>
+        <w:t xml:space="preserve">  CommandSequence cmd = new </w:t>
+      </w:r>
+      <w:proofErr w:type="gramStart"/>
+      <w:r>
+        <w:rPr>
+          <w:rFonts w:ascii="Courier New" w:eastAsia="Times New Roman" w:hAnsi="Courier New" w:cs="Courier New"/>
+          <w:color w:val="auto"/>
+          <w:szCs w:val="22"/>
+          <w:lang w:val="en-US" w:eastAsia="en-US"/>
+        </w:rPr>
+        <w:t>CommandSequence(</w:t>
+      </w:r>
+      <w:proofErr w:type="gramEnd"/>
+      <w:r>
+        <w:rPr>
+          <w:rFonts w:ascii="Courier New" w:eastAsia="Times New Roman" w:hAnsi="Courier New" w:cs="Courier New"/>
+          <w:color w:val="auto"/>
+          <w:szCs w:val="22"/>
+          <w:lang w:val="en-US" w:eastAsia="en-US"/>
+        </w:rPr>
+        <w:t>);</w:t>
       </w:r>
     </w:p>
     <w:p>
@@ -15751,7 +16722,27 @@
           <w:szCs w:val="22"/>
           <w:lang w:val="en-US" w:eastAsia="en-US"/>
         </w:rPr>
-        <w:t xml:space="preserve">  if (null != family.current) { // was changed?</w:t>
+        <w:t xml:space="preserve">  if (</w:t>
+      </w:r>
+      <w:proofErr w:type="gramStart"/>
+      <w:r>
+        <w:rPr>
+          <w:rFonts w:ascii="Courier New" w:eastAsia="Times New Roman" w:hAnsi="Courier New" w:cs="Courier New"/>
+          <w:color w:val="auto"/>
+          <w:szCs w:val="22"/>
+          <w:lang w:val="en-US" w:eastAsia="en-US"/>
+        </w:rPr>
+        <w:t>null !</w:t>
+      </w:r>
+      <w:proofErr w:type="gramEnd"/>
+      <w:r>
+        <w:rPr>
+          <w:rFonts w:ascii="Courier New" w:eastAsia="Times New Roman" w:hAnsi="Courier New" w:cs="Courier New"/>
+          <w:color w:val="auto"/>
+          <w:szCs w:val="22"/>
+          <w:lang w:val="en-US" w:eastAsia="en-US"/>
+        </w:rPr>
+        <w:t>= family.current) { // was changed?</w:t>
       </w:r>
     </w:p>
     <w:p>
@@ -15772,7 +16763,27 @@
           <w:szCs w:val="22"/>
           <w:lang w:val="en-US" w:eastAsia="en-US"/>
         </w:rPr>
-        <w:t xml:space="preserve">    cmd.add(new AlgorithmChangeCommand(pipeline.name,</w:t>
+        <w:t xml:space="preserve">    </w:t>
+      </w:r>
+      <w:proofErr w:type="gramStart"/>
+      <w:r>
+        <w:rPr>
+          <w:rFonts w:ascii="Courier New" w:eastAsia="Times New Roman" w:hAnsi="Courier New" w:cs="Courier New"/>
+          <w:color w:val="auto"/>
+          <w:szCs w:val="22"/>
+          <w:lang w:val="en-US" w:eastAsia="en-US"/>
+        </w:rPr>
+        <w:t>cmd.add(</w:t>
+      </w:r>
+      <w:proofErr w:type="gramEnd"/>
+      <w:r>
+        <w:rPr>
+          <w:rFonts w:ascii="Courier New" w:eastAsia="Times New Roman" w:hAnsi="Courier New" w:cs="Courier New"/>
+          <w:color w:val="auto"/>
+          <w:szCs w:val="22"/>
+          <w:lang w:val="en-US" w:eastAsia="en-US"/>
+        </w:rPr>
+        <w:t>new AlgorithmChangeCommand(pipeline.name,</w:t>
       </w:r>
     </w:p>
     <w:p>
@@ -15853,7 +16864,27 @@
           <w:szCs w:val="22"/>
           <w:lang w:val="en-US" w:eastAsia="en-US"/>
         </w:rPr>
-        <w:t xml:space="preserve">  map (Parameter p: family.parameters) {</w:t>
+        <w:t xml:space="preserve">  map (Parameter p: </w:t>
+      </w:r>
+      <w:proofErr w:type="gramStart"/>
+      <w:r>
+        <w:rPr>
+          <w:rFonts w:ascii="Courier New" w:eastAsia="Times New Roman" w:hAnsi="Courier New" w:cs="Courier New"/>
+          <w:color w:val="auto"/>
+          <w:szCs w:val="22"/>
+          <w:lang w:val="en-US" w:eastAsia="en-US"/>
+        </w:rPr>
+        <w:t>family.parameters</w:t>
+      </w:r>
+      <w:proofErr w:type="gramEnd"/>
+      <w:r>
+        <w:rPr>
+          <w:rFonts w:ascii="Courier New" w:eastAsia="Times New Roman" w:hAnsi="Courier New" w:cs="Courier New"/>
+          <w:color w:val="auto"/>
+          <w:szCs w:val="22"/>
+          <w:lang w:val="en-US" w:eastAsia="en-US"/>
+        </w:rPr>
+        <w:t>) {</w:t>
       </w:r>
     </w:p>
     <w:p>
@@ -15874,7 +16905,27 @@
           <w:szCs w:val="22"/>
           <w:lang w:val="en-US" w:eastAsia="en-US"/>
         </w:rPr>
-        <w:t xml:space="preserve">    cmd.add(new ParameterChangeCommand(pipeline.name,</w:t>
+        <w:t xml:space="preserve">    </w:t>
+      </w:r>
+      <w:proofErr w:type="gramStart"/>
+      <w:r>
+        <w:rPr>
+          <w:rFonts w:ascii="Courier New" w:eastAsia="Times New Roman" w:hAnsi="Courier New" w:cs="Courier New"/>
+          <w:color w:val="auto"/>
+          <w:szCs w:val="22"/>
+          <w:lang w:val="en-US" w:eastAsia="en-US"/>
+        </w:rPr>
+        <w:t>cmd.add(</w:t>
+      </w:r>
+      <w:proofErr w:type="gramEnd"/>
+      <w:r>
+        <w:rPr>
+          <w:rFonts w:ascii="Courier New" w:eastAsia="Times New Roman" w:hAnsi="Courier New" w:cs="Courier New"/>
+          <w:color w:val="auto"/>
+          <w:szCs w:val="22"/>
+          <w:lang w:val="en-US" w:eastAsia="en-US"/>
+        </w:rPr>
+        <w:t>new ParameterChangeCommand(pipeline.name,</w:t>
       </w:r>
     </w:p>
     <w:p>
@@ -15955,7 +17006,27 @@
           <w:szCs w:val="22"/>
           <w:lang w:val="en-US" w:eastAsia="en-US"/>
         </w:rPr>
-        <w:t xml:space="preserve">  map(Flow f: src) {</w:t>
+        <w:t xml:space="preserve">  </w:t>
+      </w:r>
+      <w:proofErr w:type="gramStart"/>
+      <w:r>
+        <w:rPr>
+          <w:rFonts w:ascii="Courier New" w:eastAsia="Times New Roman" w:hAnsi="Courier New" w:cs="Courier New"/>
+          <w:color w:val="auto"/>
+          <w:szCs w:val="22"/>
+          <w:lang w:val="en-US" w:eastAsia="en-US"/>
+        </w:rPr>
+        <w:t>map(</w:t>
+      </w:r>
+      <w:proofErr w:type="gramEnd"/>
+      <w:r>
+        <w:rPr>
+          <w:rFonts w:ascii="Courier New" w:eastAsia="Times New Roman" w:hAnsi="Courier New" w:cs="Courier New"/>
+          <w:color w:val="auto"/>
+          <w:szCs w:val="22"/>
+          <w:lang w:val="en-US" w:eastAsia="en-US"/>
+        </w:rPr>
+        <w:t>Flow f: src) {</w:t>
       </w:r>
     </w:p>
     <w:p>
@@ -15976,7 +17047,27 @@
           <w:szCs w:val="22"/>
           <w:lang w:val="en-US" w:eastAsia="en-US"/>
         </w:rPr>
-        <w:t xml:space="preserve">    PipelineElement e = f.destination;</w:t>
+        <w:t xml:space="preserve">    PipelineElement e = </w:t>
+      </w:r>
+      <w:proofErr w:type="gramStart"/>
+      <w:r>
+        <w:rPr>
+          <w:rFonts w:ascii="Courier New" w:eastAsia="Times New Roman" w:hAnsi="Courier New" w:cs="Courier New"/>
+          <w:color w:val="auto"/>
+          <w:szCs w:val="22"/>
+          <w:lang w:val="en-US" w:eastAsia="en-US"/>
+        </w:rPr>
+        <w:t>f.destination</w:t>
+      </w:r>
+      <w:proofErr w:type="gramEnd"/>
+      <w:r>
+        <w:rPr>
+          <w:rFonts w:ascii="Courier New" w:eastAsia="Times New Roman" w:hAnsi="Courier New" w:cs="Courier New"/>
+          <w:color w:val="auto"/>
+          <w:szCs w:val="22"/>
+          <w:lang w:val="en-US" w:eastAsia="en-US"/>
+        </w:rPr>
+        <w:t>;</w:t>
       </w:r>
     </w:p>
     <w:p>
@@ -16018,7 +17109,27 @@
           <w:szCs w:val="22"/>
           <w:lang w:val="en-US" w:eastAsia="en-US"/>
         </w:rPr>
-        <w:t xml:space="preserve">    cmd.add(new ScheduleWavefrontAdaptationCommand(</w:t>
+        <w:t xml:space="preserve">    </w:t>
+      </w:r>
+      <w:proofErr w:type="gramStart"/>
+      <w:r>
+        <w:rPr>
+          <w:rFonts w:ascii="Courier New" w:eastAsia="Times New Roman" w:hAnsi="Courier New" w:cs="Courier New"/>
+          <w:color w:val="auto"/>
+          <w:szCs w:val="22"/>
+          <w:lang w:val="en-US" w:eastAsia="en-US"/>
+        </w:rPr>
+        <w:t>cmd.add(</w:t>
+      </w:r>
+      <w:proofErr w:type="gramEnd"/>
+      <w:r>
+        <w:rPr>
+          <w:rFonts w:ascii="Courier New" w:eastAsia="Times New Roman" w:hAnsi="Courier New" w:cs="Courier New"/>
+          <w:color w:val="auto"/>
+          <w:szCs w:val="22"/>
+          <w:lang w:val="en-US" w:eastAsia="en-US"/>
+        </w:rPr>
+        <w:t>new ScheduleWavefrontAdaptationCommand(</w:t>
       </w:r>
     </w:p>
     <w:p>
@@ -16081,7 +17192,27 @@
           <w:szCs w:val="22"/>
           <w:lang w:val="en-US" w:eastAsia="en-US"/>
         </w:rPr>
-        <w:t xml:space="preserve">  cmd.execute();</w:t>
+        <w:t xml:space="preserve">  </w:t>
+      </w:r>
+      <w:proofErr w:type="gramStart"/>
+      <w:r>
+        <w:rPr>
+          <w:rFonts w:ascii="Courier New" w:eastAsia="Times New Roman" w:hAnsi="Courier New" w:cs="Courier New"/>
+          <w:color w:val="auto"/>
+          <w:szCs w:val="22"/>
+          <w:lang w:val="en-US" w:eastAsia="en-US"/>
+        </w:rPr>
+        <w:t>cmd.execute</w:t>
+      </w:r>
+      <w:proofErr w:type="gramEnd"/>
+      <w:r>
+        <w:rPr>
+          <w:rFonts w:ascii="Courier New" w:eastAsia="Times New Roman" w:hAnsi="Courier New" w:cs="Courier New"/>
+          <w:color w:val="auto"/>
+          <w:szCs w:val="22"/>
+          <w:lang w:val="en-US" w:eastAsia="en-US"/>
+        </w:rPr>
+        <w:t>();</w:t>
       </w:r>
     </w:p>
     <w:p>
@@ -16210,7 +17341,23 @@
           <w:rFonts w:ascii="Courier New" w:eastAsia="Courier New" w:hAnsi="Courier New" w:cs="Courier New"/>
           <w:szCs w:val="22"/>
         </w:rPr>
-        <w:t>Configuration cfg, mapOf(String, Double) values</w:t>
+        <w:t xml:space="preserve">Configuration cfg, </w:t>
+      </w:r>
+      <w:proofErr w:type="gramStart"/>
+      <w:r>
+        <w:rPr>
+          <w:rFonts w:ascii="Courier New" w:eastAsia="Courier New" w:hAnsi="Courier New" w:cs="Courier New"/>
+          <w:szCs w:val="22"/>
+        </w:rPr>
+        <w:t>mapOf(</w:t>
+      </w:r>
+      <w:proofErr w:type="gramEnd"/>
+      <w:r>
+        <w:rPr>
+          <w:rFonts w:ascii="Courier New" w:eastAsia="Courier New" w:hAnsi="Courier New" w:cs="Courier New"/>
+          <w:szCs w:val="22"/>
+        </w:rPr>
+        <w:t>String, Double) values</w:t>
       </w:r>
       <w:r>
         <w:rPr>
@@ -16284,13 +17431,23 @@
         </w:rPr>
         <w:t xml:space="preserve"> (</w:t>
       </w:r>
-      <w:r>
-        <w:rPr>
-          <w:rFonts w:ascii="Courier New" w:eastAsia="Courier New" w:hAnsi="Courier New" w:cs="Courier New"/>
-          <w:szCs w:val="22"/>
-          <w:lang w:val="en-US"/>
-        </w:rPr>
-        <w:t>mapOf(String, Double) values</w:t>
+      <w:proofErr w:type="gramStart"/>
+      <w:r>
+        <w:rPr>
+          <w:rFonts w:ascii="Courier New" w:eastAsia="Courier New" w:hAnsi="Courier New" w:cs="Courier New"/>
+          <w:szCs w:val="22"/>
+          <w:lang w:val="en-US"/>
+        </w:rPr>
+        <w:t>mapOf(</w:t>
+      </w:r>
+      <w:proofErr w:type="gramEnd"/>
+      <w:r>
+        <w:rPr>
+          <w:rFonts w:ascii="Courier New" w:eastAsia="Courier New" w:hAnsi="Courier New" w:cs="Courier New"/>
+          <w:szCs w:val="22"/>
+          <w:lang w:val="en-US"/>
+        </w:rPr>
+        <w:t>String, Double) values</w:t>
       </w:r>
       <w:r>
         <w:rPr>
@@ -16352,7 +17509,6 @@
           <w:b/>
           <w:lang w:val="en-US"/>
         </w:rPr>
-        <w:lastRenderedPageBreak/>
         <w:t>Example</w:t>
       </w:r>
     </w:p>
@@ -16553,16 +17709,37 @@
           <w:szCs w:val="22"/>
           <w:lang w:val="en-US" w:eastAsia="en-US"/>
         </w:rPr>
-        <w:t>@advice</w:t>
-      </w:r>
+        <w:t>@</w:t>
+      </w:r>
+      <w:proofErr w:type="gramStart"/>
       <w:r>
         <w:rPr>
           <w:rFonts w:ascii="Courier New" w:eastAsia="Times New Roman" w:hAnsi="Courier New" w:cs="Courier New"/>
-          <w:color w:val="auto"/>
-          <w:szCs w:val="22"/>
-          <w:lang w:val="en-US" w:eastAsia="en-US"/>
-        </w:rPr>
-        <w:t>(QM)</w:t>
+          <w:b/>
+          <w:color w:val="auto"/>
+          <w:szCs w:val="22"/>
+          <w:lang w:val="en-US" w:eastAsia="en-US"/>
+        </w:rPr>
+        <w:t>advice</w:t>
+      </w:r>
+      <w:r>
+        <w:rPr>
+          <w:rFonts w:ascii="Courier New" w:eastAsia="Times New Roman" w:hAnsi="Courier New" w:cs="Courier New"/>
+          <w:color w:val="auto"/>
+          <w:szCs w:val="22"/>
+          <w:lang w:val="en-US" w:eastAsia="en-US"/>
+        </w:rPr>
+        <w:t>(</w:t>
+      </w:r>
+      <w:proofErr w:type="gramEnd"/>
+      <w:r>
+        <w:rPr>
+          <w:rFonts w:ascii="Courier New" w:eastAsia="Times New Roman" w:hAnsi="Courier New" w:cs="Courier New"/>
+          <w:color w:val="auto"/>
+          <w:szCs w:val="22"/>
+          <w:lang w:val="en-US" w:eastAsia="en-US"/>
+        </w:rPr>
+        <w:t>QM)</w:t>
       </w:r>
     </w:p>
     <w:p>
@@ -16593,7 +17770,27 @@
           <w:szCs w:val="22"/>
           <w:lang w:val="en-US" w:eastAsia="en-US"/>
         </w:rPr>
-        <w:t xml:space="preserve"> mapping(Project source, Configuration config,</w:t>
+        <w:t xml:space="preserve"> </w:t>
+      </w:r>
+      <w:proofErr w:type="gramStart"/>
+      <w:r>
+        <w:rPr>
+          <w:rFonts w:ascii="Courier New" w:eastAsia="Times New Roman" w:hAnsi="Courier New" w:cs="Courier New"/>
+          <w:color w:val="auto"/>
+          <w:szCs w:val="22"/>
+          <w:lang w:val="en-US" w:eastAsia="en-US"/>
+        </w:rPr>
+        <w:t>mapping(</w:t>
+      </w:r>
+      <w:proofErr w:type="gramEnd"/>
+      <w:r>
+        <w:rPr>
+          <w:rFonts w:ascii="Courier New" w:eastAsia="Times New Roman" w:hAnsi="Courier New" w:cs="Courier New"/>
+          <w:color w:val="auto"/>
+          <w:szCs w:val="22"/>
+          <w:lang w:val="en-US" w:eastAsia="en-US"/>
+        </w:rPr>
+        <w:t>Project source, Configuration config,</w:t>
       </w:r>
     </w:p>
     <w:p>
@@ -16646,6 +17843,7 @@
         </w:rPr>
         <w:t xml:space="preserve">  </w:t>
       </w:r>
+      <w:proofErr w:type="gramStart"/>
       <w:r>
         <w:rPr>
           <w:rFonts w:ascii="Courier New" w:eastAsia="Times New Roman" w:hAnsi="Courier New" w:cs="Courier New"/>
@@ -16663,7 +17861,17 @@
           <w:szCs w:val="22"/>
           <w:lang w:val="en-US" w:eastAsia="en-US"/>
         </w:rPr>
-        <w:t>(String, Real) bindings) {</w:t>
+        <w:t>(</w:t>
+      </w:r>
+      <w:proofErr w:type="gramEnd"/>
+      <w:r>
+        <w:rPr>
+          <w:rFonts w:ascii="Courier New" w:eastAsia="Times New Roman" w:hAnsi="Courier New" w:cs="Courier New"/>
+          <w:color w:val="auto"/>
+          <w:szCs w:val="22"/>
+          <w:lang w:val="en-US" w:eastAsia="en-US"/>
+        </w:rPr>
+        <w:t>String, Real) bindings) {</w:t>
       </w:r>
     </w:p>
     <w:p>
@@ -16729,7 +17937,27 @@
           <w:szCs w:val="22"/>
           <w:lang w:val="en-US" w:eastAsia="en-US"/>
         </w:rPr>
-        <w:t xml:space="preserve">  bindValues(Configuration config, </w:t>
+        <w:t xml:space="preserve">  </w:t>
+      </w:r>
+      <w:proofErr w:type="gramStart"/>
+      <w:r>
+        <w:rPr>
+          <w:rFonts w:ascii="Courier New" w:eastAsia="Times New Roman" w:hAnsi="Courier New" w:cs="Courier New"/>
+          <w:color w:val="auto"/>
+          <w:szCs w:val="22"/>
+          <w:lang w:val="en-US" w:eastAsia="en-US"/>
+        </w:rPr>
+        <w:t>bindValues(</w:t>
+      </w:r>
+      <w:proofErr w:type="gramEnd"/>
+      <w:r>
+        <w:rPr>
+          <w:rFonts w:ascii="Courier New" w:eastAsia="Times New Roman" w:hAnsi="Courier New" w:cs="Courier New"/>
+          <w:color w:val="auto"/>
+          <w:szCs w:val="22"/>
+          <w:lang w:val="en-US" w:eastAsia="en-US"/>
+        </w:rPr>
+        <w:t xml:space="preserve">Configuration config, </w:t>
       </w:r>
     </w:p>
     <w:p>
@@ -16752,6 +17980,7 @@
         </w:rPr>
         <w:t xml:space="preserve">    </w:t>
       </w:r>
+      <w:proofErr w:type="gramStart"/>
       <w:r>
         <w:rPr>
           <w:rFonts w:ascii="Courier New" w:eastAsia="Times New Roman" w:hAnsi="Courier New" w:cs="Courier New"/>
@@ -16769,7 +17998,17 @@
           <w:szCs w:val="22"/>
           <w:lang w:val="en-US" w:eastAsia="en-US"/>
         </w:rPr>
-        <w:t xml:space="preserve">(String, Real) </w:t>
+        <w:t>(</w:t>
+      </w:r>
+      <w:proofErr w:type="gramEnd"/>
+      <w:r>
+        <w:rPr>
+          <w:rFonts w:ascii="Courier New" w:eastAsia="Times New Roman" w:hAnsi="Courier New" w:cs="Courier New"/>
+          <w:color w:val="auto"/>
+          <w:szCs w:val="22"/>
+          <w:lang w:val="en-US" w:eastAsia="en-US"/>
+        </w:rPr>
+        <w:t xml:space="preserve">String, Real) </w:t>
       </w:r>
       <w:r>
         <w:rPr>
@@ -16868,7 +18107,27 @@
           <w:szCs w:val="22"/>
           <w:lang w:val="en-US" w:eastAsia="en-US"/>
         </w:rPr>
-        <w:t xml:space="preserve">    map(Machine m: qm.machines) {</w:t>
+        <w:t xml:space="preserve">    </w:t>
+      </w:r>
+      <w:proofErr w:type="gramStart"/>
+      <w:r>
+        <w:rPr>
+          <w:rFonts w:ascii="Courier New" w:eastAsia="Times New Roman" w:hAnsi="Courier New" w:cs="Courier New"/>
+          <w:color w:val="auto"/>
+          <w:szCs w:val="22"/>
+          <w:lang w:val="en-US" w:eastAsia="en-US"/>
+        </w:rPr>
+        <w:t>map(</w:t>
+      </w:r>
+      <w:proofErr w:type="gramEnd"/>
+      <w:r>
+        <w:rPr>
+          <w:rFonts w:ascii="Courier New" w:eastAsia="Times New Roman" w:hAnsi="Courier New" w:cs="Courier New"/>
+          <w:color w:val="auto"/>
+          <w:szCs w:val="22"/>
+          <w:lang w:val="en-US" w:eastAsia="en-US"/>
+        </w:rPr>
+        <w:t>Machine m: qm.machines) {</w:t>
       </w:r>
     </w:p>
     <w:p>
@@ -16891,6 +18150,7 @@
         </w:rPr>
         <w:t xml:space="preserve">      </w:t>
       </w:r>
+      <w:proofErr w:type="gramStart"/>
       <w:r>
         <w:rPr>
           <w:rFonts w:ascii="Courier New" w:eastAsia="Times New Roman" w:hAnsi="Courier New" w:cs="Courier New"/>
@@ -16898,7 +18158,17 @@
           <w:szCs w:val="22"/>
           <w:lang w:val="en-US" w:eastAsia="en-US"/>
         </w:rPr>
-        <w:t>bindValues(m, state);</w:t>
+        <w:t>bindValues(</w:t>
+      </w:r>
+      <w:proofErr w:type="gramEnd"/>
+      <w:r>
+        <w:rPr>
+          <w:rFonts w:ascii="Courier New" w:eastAsia="Times New Roman" w:hAnsi="Courier New" w:cs="Courier New"/>
+          <w:color w:val="auto"/>
+          <w:szCs w:val="22"/>
+          <w:lang w:val="en-US" w:eastAsia="en-US"/>
+        </w:rPr>
+        <w:t>m, state);</w:t>
       </w:r>
     </w:p>
     <w:p>
@@ -17012,7 +18282,27 @@
           <w:szCs w:val="22"/>
           <w:lang w:val="en-US" w:eastAsia="en-US"/>
         </w:rPr>
-        <w:t xml:space="preserve">  bindValues(Machine machine, SystemState state) = {</w:t>
+        <w:t xml:space="preserve">  </w:t>
+      </w:r>
+      <w:proofErr w:type="gramStart"/>
+      <w:r>
+        <w:rPr>
+          <w:rFonts w:ascii="Courier New" w:eastAsia="Times New Roman" w:hAnsi="Courier New" w:cs="Courier New"/>
+          <w:color w:val="auto"/>
+          <w:szCs w:val="22"/>
+          <w:lang w:val="en-US" w:eastAsia="en-US"/>
+        </w:rPr>
+        <w:t>bindValues(</w:t>
+      </w:r>
+      <w:proofErr w:type="gramEnd"/>
+      <w:r>
+        <w:rPr>
+          <w:rFonts w:ascii="Courier New" w:eastAsia="Times New Roman" w:hAnsi="Courier New" w:cs="Courier New"/>
+          <w:color w:val="auto"/>
+          <w:szCs w:val="22"/>
+          <w:lang w:val="en-US" w:eastAsia="en-US"/>
+        </w:rPr>
+        <w:t>Machine machine, SystemState state) = {</w:t>
       </w:r>
     </w:p>
     <w:p>
@@ -17033,7 +18323,27 @@
           <w:szCs w:val="22"/>
           <w:lang w:val="en-US" w:eastAsia="en-US"/>
         </w:rPr>
-        <w:t xml:space="preserve">    machine.bandwidth = state.getMachineObservation(</w:t>
+        <w:t xml:space="preserve">    </w:t>
+      </w:r>
+      <w:proofErr w:type="gramStart"/>
+      <w:r>
+        <w:rPr>
+          <w:rFonts w:ascii="Courier New" w:eastAsia="Times New Roman" w:hAnsi="Courier New" w:cs="Courier New"/>
+          <w:color w:val="auto"/>
+          <w:szCs w:val="22"/>
+          <w:lang w:val="en-US" w:eastAsia="en-US"/>
+        </w:rPr>
+        <w:t>machine.bandwidth</w:t>
+      </w:r>
+      <w:proofErr w:type="gramEnd"/>
+      <w:r>
+        <w:rPr>
+          <w:rFonts w:ascii="Courier New" w:eastAsia="Times New Roman" w:hAnsi="Courier New" w:cs="Courier New"/>
+          <w:color w:val="auto"/>
+          <w:szCs w:val="22"/>
+          <w:lang w:val="en-US" w:eastAsia="en-US"/>
+        </w:rPr>
+        <w:t xml:space="preserve"> = state.getMachineObservation(</w:t>
       </w:r>
     </w:p>
     <w:p>
@@ -17056,6 +18366,7 @@
         </w:rPr>
         <w:t xml:space="preserve">     </w:t>
       </w:r>
+      <w:proofErr w:type="gramStart"/>
       <w:r>
         <w:rPr>
           <w:rFonts w:ascii="Courier New" w:eastAsia="Times New Roman" w:hAnsi="Courier New" w:cs="Courier New"/>
@@ -17063,7 +18374,17 @@
           <w:szCs w:val="22"/>
           <w:lang w:val="en-US" w:eastAsia="en-US"/>
         </w:rPr>
-        <w:t>machine.name(), ResourceUsage.BANDWIDTH);</w:t>
+        <w:t>machine.name(</w:t>
+      </w:r>
+      <w:proofErr w:type="gramEnd"/>
+      <w:r>
+        <w:rPr>
+          <w:rFonts w:ascii="Courier New" w:eastAsia="Times New Roman" w:hAnsi="Courier New" w:cs="Courier New"/>
+          <w:color w:val="auto"/>
+          <w:szCs w:val="22"/>
+          <w:lang w:val="en-US" w:eastAsia="en-US"/>
+        </w:rPr>
+        <w:t>), ResourceUsage.BANDWIDTH);</w:t>
       </w:r>
     </w:p>
     <w:p>
@@ -17171,7 +18492,6 @@
         <w:rPr>
           <w:lang w:val="en-GB"/>
         </w:rPr>
-        <w:lastRenderedPageBreak/>
         <w:t xml:space="preserve">Built-in </w:t>
       </w:r>
       <w:r>
@@ -17715,7 +19035,23 @@
           <w:b/>
           <w:lang w:val="en-GB"/>
         </w:rPr>
-        <w:t>Configuration copy()</w:t>
+        <w:t xml:space="preserve">Configuration </w:t>
+      </w:r>
+      <w:proofErr w:type="gramStart"/>
+      <w:r>
+        <w:rPr>
+          <w:b/>
+          <w:lang w:val="en-GB"/>
+        </w:rPr>
+        <w:t>copy(</w:t>
+      </w:r>
+      <w:proofErr w:type="gramEnd"/>
+      <w:r>
+        <w:rPr>
+          <w:b/>
+          <w:lang w:val="en-GB"/>
+        </w:rPr>
+        <w:t>)</w:t>
       </w:r>
     </w:p>
     <w:p>
@@ -17775,7 +19111,23 @@
           <w:b/>
           <w:lang w:val="en-GB"/>
         </w:rPr>
-        <w:t>Configuration selectFrozen()</w:t>
+        <w:t xml:space="preserve">Configuration </w:t>
+      </w:r>
+      <w:proofErr w:type="gramStart"/>
+      <w:r>
+        <w:rPr>
+          <w:b/>
+          <w:lang w:val="en-GB"/>
+        </w:rPr>
+        <w:t>selectFrozen(</w:t>
+      </w:r>
+      <w:proofErr w:type="gramEnd"/>
+      <w:r>
+        <w:rPr>
+          <w:b/>
+          <w:lang w:val="en-GB"/>
+        </w:rPr>
+        <w:t>)</w:t>
       </w:r>
     </w:p>
     <w:p>
@@ -17846,7 +19198,23 @@
           <w:b/>
           <w:lang w:val="en-GB"/>
         </w:rPr>
-        <w:t>Configuration selectAll()</w:t>
+        <w:t xml:space="preserve">Configuration </w:t>
+      </w:r>
+      <w:proofErr w:type="gramStart"/>
+      <w:r>
+        <w:rPr>
+          <w:b/>
+          <w:lang w:val="en-GB"/>
+        </w:rPr>
+        <w:t>selectAll(</w:t>
+      </w:r>
+      <w:proofErr w:type="gramEnd"/>
+      <w:r>
+        <w:rPr>
+          <w:b/>
+          <w:lang w:val="en-GB"/>
+        </w:rPr>
+        <w:t>)</w:t>
       </w:r>
     </w:p>
     <w:p>
@@ -17932,7 +19300,6 @@
         <w:rPr>
           <w:lang w:val="en-GB"/>
         </w:rPr>
-        <w:lastRenderedPageBreak/>
         <w:t xml:space="preserve">Projects </w:t>
       </w:r>
       <w:r>
@@ -17984,7 +19351,23 @@
           <w:b/>
           <w:lang w:val="en-GB"/>
         </w:rPr>
-        <w:t>Configuration selectChangedWithContext()</w:t>
+        <w:t xml:space="preserve">Configuration </w:t>
+      </w:r>
+      <w:proofErr w:type="gramStart"/>
+      <w:r>
+        <w:rPr>
+          <w:b/>
+          <w:lang w:val="en-GB"/>
+        </w:rPr>
+        <w:t>selectChangedWithContext(</w:t>
+      </w:r>
+      <w:proofErr w:type="gramEnd"/>
+      <w:r>
+        <w:rPr>
+          <w:b/>
+          <w:lang w:val="en-GB"/>
+        </w:rPr>
+        <w:t>)</w:t>
       </w:r>
     </w:p>
     <w:p>
@@ -18050,7 +19433,23 @@
           <w:b/>
           <w:lang w:val="en-GB"/>
         </w:rPr>
-        <w:t>ChangeHistory changeHistory() / ChangeHistory getChangeHistory()</w:t>
+        <w:t xml:space="preserve">ChangeHistory </w:t>
+      </w:r>
+      <w:proofErr w:type="gramStart"/>
+      <w:r>
+        <w:rPr>
+          <w:b/>
+          <w:lang w:val="en-GB"/>
+        </w:rPr>
+        <w:t>changeHistory(</w:t>
+      </w:r>
+      <w:proofErr w:type="gramEnd"/>
+      <w:r>
+        <w:rPr>
+          <w:b/>
+          <w:lang w:val="en-GB"/>
+        </w:rPr>
+        <w:t>) / ChangeHistory getChangeHistory()</w:t>
       </w:r>
     </w:p>
     <w:p>
@@ -18099,6 +19498,7 @@
         </w:rPr>
         <w:t xml:space="preserve">Configuration </w:t>
       </w:r>
+      <w:proofErr w:type="gramStart"/>
       <w:r>
         <w:rPr>
           <w:b/>
@@ -18111,7 +19511,15 @@
           <w:b/>
           <w:lang w:val="en-GB"/>
         </w:rPr>
-        <w:t xml:space="preserve">() </w:t>
+        <w:t>(</w:t>
+      </w:r>
+      <w:proofErr w:type="gramEnd"/>
+      <w:r>
+        <w:rPr>
+          <w:b/>
+          <w:lang w:val="en-GB"/>
+        </w:rPr>
+        <w:t xml:space="preserve">) </w:t>
       </w:r>
     </w:p>
     <w:p>
@@ -18147,6 +19555,7 @@
         </w:rPr>
         <w:t xml:space="preserve"> the result of </w:t>
       </w:r>
+      <w:proofErr w:type="gramStart"/>
       <w:r>
         <w:rPr>
           <w:rFonts w:ascii="Courier New" w:hAnsi="Courier New" w:cs="Courier New"/>
@@ -18154,7 +19563,17 @@
           <w:szCs w:val="22"/>
           <w:lang w:val="en-GB"/>
         </w:rPr>
-        <w:t>isValid()</w:t>
+        <w:t>isValid(</w:t>
+      </w:r>
+      <w:proofErr w:type="gramEnd"/>
+      <w:r>
+        <w:rPr>
+          <w:rFonts w:ascii="Courier New" w:hAnsi="Courier New" w:cs="Courier New"/>
+          <w:sz w:val="22"/>
+          <w:szCs w:val="22"/>
+          <w:lang w:val="en-GB"/>
+        </w:rPr>
+        <w:t>)</w:t>
       </w:r>
       <w:r>
         <w:rPr>
@@ -18180,7 +19599,23 @@
           <w:b/>
           <w:lang w:val="en-GB"/>
         </w:rPr>
-        <w:t>Boolean isValid()</w:t>
+        <w:t xml:space="preserve">Boolean </w:t>
+      </w:r>
+      <w:proofErr w:type="gramStart"/>
+      <w:r>
+        <w:rPr>
+          <w:b/>
+          <w:lang w:val="en-GB"/>
+        </w:rPr>
+        <w:t>isValid(</w:t>
+      </w:r>
+      <w:proofErr w:type="gramEnd"/>
+      <w:r>
+        <w:rPr>
+          <w:b/>
+          <w:lang w:val="en-GB"/>
+        </w:rPr>
+        <w:t>)</w:t>
       </w:r>
     </w:p>
     <w:p>
@@ -18279,12 +19714,21 @@
           <w:lang w:val="en-GB"/>
         </w:rPr>
       </w:pPr>
+      <w:proofErr w:type="gramStart"/>
       <w:r>
         <w:rPr>
           <w:b/>
           <w:lang w:val="en-GB"/>
         </w:rPr>
-        <w:t>clearValue()</w:t>
+        <w:t>clearValue(</w:t>
+      </w:r>
+      <w:proofErr w:type="gramEnd"/>
+      <w:r>
+        <w:rPr>
+          <w:b/>
+          <w:lang w:val="en-GB"/>
+        </w:rPr>
+        <w:t>)</w:t>
       </w:r>
     </w:p>
     <w:p>
@@ -18337,7 +19781,23 @@
           <w:b/>
           <w:lang w:val="en-GB"/>
         </w:rPr>
-        <w:t>Boolean isValid()</w:t>
+        <w:t xml:space="preserve">Boolean </w:t>
+      </w:r>
+      <w:proofErr w:type="gramStart"/>
+      <w:r>
+        <w:rPr>
+          <w:b/>
+          <w:lang w:val="en-GB"/>
+        </w:rPr>
+        <w:t>isValid(</w:t>
+      </w:r>
+      <w:proofErr w:type="gramEnd"/>
+      <w:r>
+        <w:rPr>
+          <w:b/>
+          <w:lang w:val="en-GB"/>
+        </w:rPr>
+        <w:t>)</w:t>
       </w:r>
     </w:p>
     <w:p>
@@ -18412,7 +19872,23 @@
           <w:b/>
           <w:lang w:val="en-GB"/>
         </w:rPr>
-        <w:t xml:space="preserve">Boolean isEnacting() </w:t>
+        <w:t xml:space="preserve">Boolean </w:t>
+      </w:r>
+      <w:proofErr w:type="gramStart"/>
+      <w:r>
+        <w:rPr>
+          <w:b/>
+          <w:lang w:val="en-GB"/>
+        </w:rPr>
+        <w:t>isEnacting(</w:t>
+      </w:r>
+      <w:proofErr w:type="gramEnd"/>
+      <w:r>
+        <w:rPr>
+          <w:b/>
+          <w:lang w:val="en-GB"/>
+        </w:rPr>
+        <w:t xml:space="preserve">) </w:t>
       </w:r>
     </w:p>
     <w:p>
@@ -18524,12 +20000,21 @@
           <w:lang w:val="en-GB"/>
         </w:rPr>
       </w:pPr>
+      <w:proofErr w:type="gramStart"/>
       <w:r>
         <w:rPr>
           <w:b/>
           <w:lang w:val="en-GB"/>
         </w:rPr>
-        <w:t>start()</w:t>
+        <w:t>start(</w:t>
+      </w:r>
+      <w:proofErr w:type="gramEnd"/>
+      <w:r>
+        <w:rPr>
+          <w:b/>
+          <w:lang w:val="en-GB"/>
+        </w:rPr>
+        <w:t>)</w:t>
       </w:r>
     </w:p>
     <w:p>
@@ -18577,12 +20062,21 @@
           <w:lang w:val="en-GB"/>
         </w:rPr>
       </w:pPr>
+      <w:proofErr w:type="gramStart"/>
       <w:r>
         <w:rPr>
           <w:b/>
           <w:lang w:val="en-GB"/>
         </w:rPr>
-        <w:t>rollback()</w:t>
+        <w:t>rollback(</w:t>
+      </w:r>
+      <w:proofErr w:type="gramEnd"/>
+      <w:r>
+        <w:rPr>
+          <w:b/>
+          <w:lang w:val="en-GB"/>
+        </w:rPr>
+        <w:t>)</w:t>
       </w:r>
     </w:p>
     <w:p>
@@ -18630,12 +20124,21 @@
           <w:lang w:val="en-GB"/>
         </w:rPr>
       </w:pPr>
+      <w:proofErr w:type="gramStart"/>
       <w:r>
         <w:rPr>
           <w:b/>
           <w:lang w:val="en-GB"/>
         </w:rPr>
-        <w:t>commit()</w:t>
+        <w:t>commit(</w:t>
+      </w:r>
+      <w:proofErr w:type="gramEnd"/>
+      <w:r>
+        <w:rPr>
+          <w:b/>
+          <w:lang w:val="en-GB"/>
+        </w:rPr>
+        <w:t>)</w:t>
       </w:r>
     </w:p>
     <w:p>
@@ -18649,7 +20152,6 @@
         <w:rPr>
           <w:lang w:val="en-GB"/>
         </w:rPr>
-        <w:lastRenderedPageBreak/>
         <w:t xml:space="preserve">Committs all changes collected in the most recent transaction of </w:t>
       </w:r>
       <w:r>
@@ -19270,7 +20772,6 @@
         <w:rPr>
           <w:lang w:val="en-GB"/>
         </w:rPr>
-        <w:lastRenderedPageBreak/>
         <w:t>Implementation Status</w:t>
       </w:r>
       <w:bookmarkEnd w:id="2134"/>
@@ -19342,7 +20843,6 @@
           <w:b w:val="0"/>
           <w:lang w:val="en-GB"/>
         </w:rPr>
-        <w:lastRenderedPageBreak/>
         <w:t>rt</w:t>
       </w:r>
       <w:r>
@@ -20547,7 +22047,6 @@
           <w:sz w:val="20"/>
           <w:lang w:val="en-US"/>
         </w:rPr>
-        <w:lastRenderedPageBreak/>
         <w:t xml:space="preserve">    </w:t>
       </w:r>
       <w:r>
@@ -22040,7 +23539,6 @@
         <w:rPr>
           <w:lang w:val="en-GB"/>
         </w:rPr>
-        <w:lastRenderedPageBreak/>
         <w:t>References</w:t>
       </w:r>
       <w:bookmarkEnd w:id="2148"/>

</xml_diff>